<commit_message>
docs(lead): [S0-06] finalize AKTU 2026-27 synopsis with supervisor and roll numbers
</commit_message>
<xml_diff>
--- a/docs/07_Project_Synopsis_AKTU_2026_27_v1.1.docx
+++ b/docs/07_Project_Synopsis_AKTU_2026_27_v1.1.docx
@@ -26,7 +26,7 @@
           <w:rFonts w:cs="Times New Roman"/>
           <w:b/>
           <w:color w:val="000000"/>
-          <w:sz w:val="36"/>
+          <w:sz w:val="40"/>
         </w:rPr>
         <w:t>AUTOMATED EXPENDITURE TRACKER WITH QR-INTEGRATED PAYMENT GATEWAY LOG ANALYSIS</w:t>
       </w:r>
@@ -67,7 +67,6 @@
       <w:r>
         <w:rPr>
           <w:rFonts w:cs="Times New Roman"/>
-          <w:b/>
           <w:color w:val="000000"/>
           <w:sz w:val="28"/>
         </w:rPr>
@@ -100,7 +99,7 @@
           <w:color w:val="000000"/>
           <w:sz w:val="28"/>
         </w:rPr>
-        <w:t>Anuj Kushwaha</w:t>
+        <w:t>Anuj Kushwaha (2308020100017)</w:t>
       </w:r>
     </w:p>
     <w:p>
@@ -115,7 +114,7 @@
           <w:color w:val="000000"/>
           <w:sz w:val="28"/>
         </w:rPr>
-        <w:t>Saurabh Yadav</w:t>
+        <w:t>Saurabh Yadav (2308020100085)</w:t>
       </w:r>
     </w:p>
     <w:p>
@@ -130,12 +129,12 @@
           <w:color w:val="000000"/>
           <w:sz w:val="28"/>
         </w:rPr>
-        <w:t>Sumit Kushwaha</w:t>
+        <w:t>Sumit Kushwaha (2308020100098)</w:t>
       </w:r>
     </w:p>
     <w:p>
       <w:pPr>
-        <w:spacing w:before="20" w:after="280"/>
+        <w:spacing w:before="20" w:after="320"/>
         <w:jc w:val="center"/>
       </w:pPr>
       <w:r>
@@ -145,7 +144,7 @@
           <w:color w:val="000000"/>
           <w:sz w:val="28"/>
         </w:rPr>
-        <w:t>Uday Paswan</w:t>
+        <w:t>Uday Paswan (2308020100102)</w:t>
       </w:r>
     </w:p>
     <w:p>
@@ -164,7 +163,7 @@
     </w:p>
     <w:p>
       <w:pPr>
-        <w:spacing w:before="40" w:after="40"/>
+        <w:spacing w:before="40" w:after="320"/>
         <w:jc w:val="center"/>
       </w:pPr>
       <w:r>
@@ -174,26 +173,12 @@
           <w:color w:val="000000"/>
           <w:sz w:val="28"/>
         </w:rPr>
-        <w:t>Dr. A.P. Srivastava</w:t>
+        <w:t>Dr. A. P. Srivastava</w:t>
       </w:r>
     </w:p>
     <w:p>
       <w:pPr>
-        <w:spacing w:after="280"/>
-        <w:jc w:val="center"/>
-      </w:pPr>
-      <w:r>
-        <w:rPr>
-          <w:rFonts w:cs="Times New Roman"/>
-          <w:i/>
-          <w:color w:val="000000"/>
-        </w:rPr>
-        <w:t>Department of Computer Science &amp; Engineering</w:t>
-      </w:r>
-    </w:p>
-    <w:p>
-      <w:pPr>
-        <w:spacing w:before="80" w:after="160"/>
+        <w:spacing w:before="80" w:after="200"/>
         <w:jc w:val="center"/>
       </w:pPr>
       <w:r>
@@ -201,8 +186,8 @@
           <w:noProof/>
         </w:rPr>
         <w:drawing>
-          <wp:inline distT="0" distB="0" distL="0" distR="0" wp14:anchorId="36104DB5" wp14:editId="2A81D659">
-            <wp:extent cx="1188720" cy="905048"/>
+          <wp:inline distT="0" distB="0" distL="0" distR="0" wp14:anchorId="38F89690" wp14:editId="33B4F631">
+            <wp:extent cx="1234440" cy="939858"/>
             <wp:effectExtent l="0" t="0" r="0" b="0"/>
             <wp:docPr id="1" name="Picture 1"/>
             <wp:cNvGraphicFramePr>
@@ -224,7 +209,7 @@
                   <pic:spPr>
                     <a:xfrm>
                       <a:off x="0" y="0"/>
-                      <a:ext cx="1188720" cy="905048"/>
+                      <a:ext cx="1234440" cy="939858"/>
                     </a:xfrm>
                     <a:prstGeom prst="rect">
                       <a:avLst/>
@@ -239,7 +224,7 @@
     </w:p>
     <w:p>
       <w:pPr>
-        <w:spacing w:before="80"/>
+        <w:spacing w:before="120" w:after="120"/>
         <w:jc w:val="center"/>
       </w:pPr>
       <w:r>
@@ -254,26 +239,12 @@
     </w:p>
     <w:p>
       <w:pPr>
-        <w:spacing w:after="120"/>
-        <w:jc w:val="center"/>
-      </w:pPr>
-      <w:r>
-        <w:rPr>
-          <w:rFonts w:cs="Times New Roman"/>
-          <w:color w:val="000000"/>
-        </w:rPr>
-        <w:t>(Affiliated to Dr. A.P.J. Abdul Kalam Technical University, Lucknow, U.P.)</w:t>
-      </w:r>
-    </w:p>
-    <w:p>
-      <w:pPr>
         <w:spacing w:before="80" w:after="0"/>
         <w:jc w:val="center"/>
       </w:pPr>
       <w:r>
         <w:rPr>
           <w:rFonts w:cs="Times New Roman"/>
-          <w:b/>
           <w:color w:val="000000"/>
           <w:sz w:val="28"/>
         </w:rPr>
@@ -329,9 +300,9 @@
             </w:tcBorders>
             <w:shd w:val="clear" w:color="auto" w:fill="EFEFEF"/>
             <w:tcMar>
-              <w:top w:w="80" w:type="dxa"/>
+              <w:top w:w="70" w:type="dxa"/>
               <w:left w:w="100" w:type="dxa"/>
-              <w:bottom w:w="80" w:type="dxa"/>
+              <w:bottom w:w="70" w:type="dxa"/>
               <w:right w:w="100" w:type="dxa"/>
             </w:tcMar>
           </w:tcPr>
@@ -362,9 +333,9 @@
             </w:tcBorders>
             <w:shd w:val="clear" w:color="auto" w:fill="EFEFEF"/>
             <w:tcMar>
-              <w:top w:w="80" w:type="dxa"/>
+              <w:top w:w="70" w:type="dxa"/>
               <w:left w:w="100" w:type="dxa"/>
-              <w:bottom w:w="80" w:type="dxa"/>
+              <w:bottom w:w="70" w:type="dxa"/>
               <w:right w:w="100" w:type="dxa"/>
             </w:tcMar>
           </w:tcPr>
@@ -394,9 +365,9 @@
             </w:tcBorders>
             <w:shd w:val="clear" w:color="auto" w:fill="EFEFEF"/>
             <w:tcMar>
-              <w:top w:w="80" w:type="dxa"/>
+              <w:top w:w="70" w:type="dxa"/>
               <w:left w:w="100" w:type="dxa"/>
-              <w:bottom w:w="80" w:type="dxa"/>
+              <w:bottom w:w="70" w:type="dxa"/>
               <w:right w:w="100" w:type="dxa"/>
             </w:tcMar>
           </w:tcPr>
@@ -431,9 +402,9 @@
               <w:right w:val="single" w:sz="4" w:space="0" w:color="000000"/>
             </w:tcBorders>
             <w:tcMar>
-              <w:top w:w="75" w:type="dxa"/>
+              <w:top w:w="65" w:type="dxa"/>
               <w:left w:w="100" w:type="dxa"/>
-              <w:bottom w:w="75" w:type="dxa"/>
+              <w:bottom w:w="65" w:type="dxa"/>
               <w:right w:w="100" w:type="dxa"/>
             </w:tcMar>
           </w:tcPr>
@@ -461,9 +432,9 @@
               <w:right w:val="single" w:sz="4" w:space="0" w:color="000000"/>
             </w:tcBorders>
             <w:tcMar>
-              <w:top w:w="75" w:type="dxa"/>
+              <w:top w:w="65" w:type="dxa"/>
               <w:left w:w="100" w:type="dxa"/>
-              <w:bottom w:w="75" w:type="dxa"/>
+              <w:bottom w:w="65" w:type="dxa"/>
               <w:right w:w="100" w:type="dxa"/>
             </w:tcMar>
           </w:tcPr>
@@ -490,9 +461,9 @@
               <w:right w:val="single" w:sz="4" w:space="0" w:color="000000"/>
             </w:tcBorders>
             <w:tcMar>
-              <w:top w:w="75" w:type="dxa"/>
+              <w:top w:w="65" w:type="dxa"/>
               <w:left w:w="100" w:type="dxa"/>
-              <w:bottom w:w="75" w:type="dxa"/>
+              <w:bottom w:w="65" w:type="dxa"/>
               <w:right w:w="100" w:type="dxa"/>
             </w:tcMar>
           </w:tcPr>
@@ -525,9 +496,9 @@
               <w:right w:val="single" w:sz="4" w:space="0" w:color="000000"/>
             </w:tcBorders>
             <w:tcMar>
-              <w:top w:w="75" w:type="dxa"/>
+              <w:top w:w="65" w:type="dxa"/>
               <w:left w:w="100" w:type="dxa"/>
-              <w:bottom w:w="75" w:type="dxa"/>
+              <w:bottom w:w="65" w:type="dxa"/>
               <w:right w:w="100" w:type="dxa"/>
             </w:tcMar>
           </w:tcPr>
@@ -555,9 +526,9 @@
               <w:right w:val="single" w:sz="4" w:space="0" w:color="000000"/>
             </w:tcBorders>
             <w:tcMar>
-              <w:top w:w="75" w:type="dxa"/>
+              <w:top w:w="65" w:type="dxa"/>
               <w:left w:w="100" w:type="dxa"/>
-              <w:bottom w:w="75" w:type="dxa"/>
+              <w:bottom w:w="65" w:type="dxa"/>
               <w:right w:w="100" w:type="dxa"/>
             </w:tcMar>
           </w:tcPr>
@@ -584,9 +555,9 @@
               <w:right w:val="single" w:sz="4" w:space="0" w:color="000000"/>
             </w:tcBorders>
             <w:tcMar>
-              <w:top w:w="75" w:type="dxa"/>
+              <w:top w:w="65" w:type="dxa"/>
               <w:left w:w="100" w:type="dxa"/>
-              <w:bottom w:w="75" w:type="dxa"/>
+              <w:bottom w:w="65" w:type="dxa"/>
               <w:right w:w="100" w:type="dxa"/>
             </w:tcMar>
           </w:tcPr>
@@ -619,9 +590,9 @@
               <w:right w:val="single" w:sz="4" w:space="0" w:color="000000"/>
             </w:tcBorders>
             <w:tcMar>
-              <w:top w:w="75" w:type="dxa"/>
+              <w:top w:w="65" w:type="dxa"/>
               <w:left w:w="100" w:type="dxa"/>
-              <w:bottom w:w="75" w:type="dxa"/>
+              <w:bottom w:w="65" w:type="dxa"/>
               <w:right w:w="100" w:type="dxa"/>
             </w:tcMar>
           </w:tcPr>
@@ -649,9 +620,9 @@
               <w:right w:val="single" w:sz="4" w:space="0" w:color="000000"/>
             </w:tcBorders>
             <w:tcMar>
-              <w:top w:w="75" w:type="dxa"/>
+              <w:top w:w="65" w:type="dxa"/>
               <w:left w:w="100" w:type="dxa"/>
-              <w:bottom w:w="75" w:type="dxa"/>
+              <w:bottom w:w="65" w:type="dxa"/>
               <w:right w:w="100" w:type="dxa"/>
             </w:tcMar>
           </w:tcPr>
@@ -678,9 +649,9 @@
               <w:right w:val="single" w:sz="4" w:space="0" w:color="000000"/>
             </w:tcBorders>
             <w:tcMar>
-              <w:top w:w="75" w:type="dxa"/>
+              <w:top w:w="65" w:type="dxa"/>
               <w:left w:w="100" w:type="dxa"/>
-              <w:bottom w:w="75" w:type="dxa"/>
+              <w:bottom w:w="65" w:type="dxa"/>
               <w:right w:w="100" w:type="dxa"/>
             </w:tcMar>
           </w:tcPr>
@@ -713,9 +684,9 @@
               <w:right w:val="single" w:sz="4" w:space="0" w:color="000000"/>
             </w:tcBorders>
             <w:tcMar>
-              <w:top w:w="75" w:type="dxa"/>
+              <w:top w:w="65" w:type="dxa"/>
               <w:left w:w="100" w:type="dxa"/>
-              <w:bottom w:w="75" w:type="dxa"/>
+              <w:bottom w:w="65" w:type="dxa"/>
               <w:right w:w="100" w:type="dxa"/>
             </w:tcMar>
           </w:tcPr>
@@ -743,9 +714,9 @@
               <w:right w:val="single" w:sz="4" w:space="0" w:color="000000"/>
             </w:tcBorders>
             <w:tcMar>
-              <w:top w:w="75" w:type="dxa"/>
+              <w:top w:w="65" w:type="dxa"/>
               <w:left w:w="100" w:type="dxa"/>
-              <w:bottom w:w="75" w:type="dxa"/>
+              <w:bottom w:w="65" w:type="dxa"/>
               <w:right w:w="100" w:type="dxa"/>
             </w:tcMar>
           </w:tcPr>
@@ -772,9 +743,9 @@
               <w:right w:val="single" w:sz="4" w:space="0" w:color="000000"/>
             </w:tcBorders>
             <w:tcMar>
-              <w:top w:w="75" w:type="dxa"/>
+              <w:top w:w="65" w:type="dxa"/>
               <w:left w:w="100" w:type="dxa"/>
-              <w:bottom w:w="75" w:type="dxa"/>
+              <w:bottom w:w="65" w:type="dxa"/>
               <w:right w:w="100" w:type="dxa"/>
             </w:tcMar>
           </w:tcPr>
@@ -807,9 +778,9 @@
               <w:right w:val="single" w:sz="4" w:space="0" w:color="000000"/>
             </w:tcBorders>
             <w:tcMar>
-              <w:top w:w="75" w:type="dxa"/>
+              <w:top w:w="65" w:type="dxa"/>
               <w:left w:w="100" w:type="dxa"/>
-              <w:bottom w:w="75" w:type="dxa"/>
+              <w:bottom w:w="65" w:type="dxa"/>
               <w:right w:w="100" w:type="dxa"/>
             </w:tcMar>
           </w:tcPr>
@@ -837,9 +808,9 @@
               <w:right w:val="single" w:sz="4" w:space="0" w:color="000000"/>
             </w:tcBorders>
             <w:tcMar>
-              <w:top w:w="75" w:type="dxa"/>
+              <w:top w:w="65" w:type="dxa"/>
               <w:left w:w="100" w:type="dxa"/>
-              <w:bottom w:w="75" w:type="dxa"/>
+              <w:bottom w:w="65" w:type="dxa"/>
               <w:right w:w="100" w:type="dxa"/>
             </w:tcMar>
           </w:tcPr>
@@ -866,9 +837,9 @@
               <w:right w:val="single" w:sz="4" w:space="0" w:color="000000"/>
             </w:tcBorders>
             <w:tcMar>
-              <w:top w:w="75" w:type="dxa"/>
+              <w:top w:w="65" w:type="dxa"/>
               <w:left w:w="100" w:type="dxa"/>
-              <w:bottom w:w="75" w:type="dxa"/>
+              <w:bottom w:w="65" w:type="dxa"/>
               <w:right w:w="100" w:type="dxa"/>
             </w:tcMar>
           </w:tcPr>
@@ -901,9 +872,9 @@
               <w:right w:val="single" w:sz="4" w:space="0" w:color="000000"/>
             </w:tcBorders>
             <w:tcMar>
-              <w:top w:w="75" w:type="dxa"/>
+              <w:top w:w="65" w:type="dxa"/>
               <w:left w:w="100" w:type="dxa"/>
-              <w:bottom w:w="75" w:type="dxa"/>
+              <w:bottom w:w="65" w:type="dxa"/>
               <w:right w:w="100" w:type="dxa"/>
             </w:tcMar>
           </w:tcPr>
@@ -931,9 +902,9 @@
               <w:right w:val="single" w:sz="4" w:space="0" w:color="000000"/>
             </w:tcBorders>
             <w:tcMar>
-              <w:top w:w="75" w:type="dxa"/>
+              <w:top w:w="65" w:type="dxa"/>
               <w:left w:w="100" w:type="dxa"/>
-              <w:bottom w:w="75" w:type="dxa"/>
+              <w:bottom w:w="65" w:type="dxa"/>
               <w:right w:w="100" w:type="dxa"/>
             </w:tcMar>
           </w:tcPr>
@@ -960,9 +931,9 @@
               <w:right w:val="single" w:sz="4" w:space="0" w:color="000000"/>
             </w:tcBorders>
             <w:tcMar>
-              <w:top w:w="75" w:type="dxa"/>
+              <w:top w:w="65" w:type="dxa"/>
               <w:left w:w="100" w:type="dxa"/>
-              <w:bottom w:w="75" w:type="dxa"/>
+              <w:bottom w:w="65" w:type="dxa"/>
               <w:right w:w="100" w:type="dxa"/>
             </w:tcMar>
           </w:tcPr>
@@ -995,9 +966,9 @@
               <w:right w:val="single" w:sz="4" w:space="0" w:color="000000"/>
             </w:tcBorders>
             <w:tcMar>
-              <w:top w:w="75" w:type="dxa"/>
+              <w:top w:w="65" w:type="dxa"/>
               <w:left w:w="100" w:type="dxa"/>
-              <w:bottom w:w="75" w:type="dxa"/>
+              <w:bottom w:w="65" w:type="dxa"/>
               <w:right w:w="100" w:type="dxa"/>
             </w:tcMar>
           </w:tcPr>
@@ -1025,9 +996,9 @@
               <w:right w:val="single" w:sz="4" w:space="0" w:color="000000"/>
             </w:tcBorders>
             <w:tcMar>
-              <w:top w:w="75" w:type="dxa"/>
+              <w:top w:w="65" w:type="dxa"/>
               <w:left w:w="100" w:type="dxa"/>
-              <w:bottom w:w="75" w:type="dxa"/>
+              <w:bottom w:w="65" w:type="dxa"/>
               <w:right w:w="100" w:type="dxa"/>
             </w:tcMar>
           </w:tcPr>
@@ -1054,9 +1025,9 @@
               <w:right w:val="single" w:sz="4" w:space="0" w:color="000000"/>
             </w:tcBorders>
             <w:tcMar>
-              <w:top w:w="75" w:type="dxa"/>
+              <w:top w:w="65" w:type="dxa"/>
               <w:left w:w="100" w:type="dxa"/>
-              <w:bottom w:w="75" w:type="dxa"/>
+              <w:bottom w:w="65" w:type="dxa"/>
               <w:right w:w="100" w:type="dxa"/>
             </w:tcMar>
           </w:tcPr>
@@ -1070,7 +1041,7 @@
                 <w:rFonts w:cs="Times New Roman"/>
                 <w:color w:val="000000"/>
               </w:rPr>
-              <w:t>10</w:t>
+              <w:t>9</w:t>
             </w:r>
           </w:p>
         </w:tc>
@@ -1088,7 +1059,7 @@
           <w:color w:val="000000"/>
           <w:sz w:val="28"/>
         </w:rPr>
-        <w:t>Name / Title of the Project &amp; Team Allocation Summary</w:t>
+        <w:t>Name / Title of the Project &amp; Candidate Details</w:t>
       </w:r>
     </w:p>
     <w:tbl>
@@ -1099,8 +1070,8 @@
         <w:tblLook w:val="04A0" w:firstRow="1" w:lastRow="0" w:firstColumn="1" w:lastColumn="0" w:noHBand="0" w:noVBand="1"/>
       </w:tblPr>
       <w:tblGrid>
-        <w:gridCol w:w="2381"/>
-        <w:gridCol w:w="6179"/>
+        <w:gridCol w:w="3061"/>
+        <w:gridCol w:w="5499"/>
       </w:tblGrid>
       <w:tr>
         <w:trPr>
@@ -1108,7 +1079,7 @@
         </w:trPr>
         <w:tc>
           <w:tcPr>
-            <w:tcW w:w="2381" w:type="dxa"/>
+            <w:tcW w:w="3061" w:type="dxa"/>
             <w:tcBorders>
               <w:top w:val="single" w:sz="4" w:space="0" w:color="000000"/>
               <w:left w:val="single" w:sz="4" w:space="0" w:color="000000"/>
@@ -1117,10 +1088,10 @@
             </w:tcBorders>
             <w:shd w:val="clear" w:color="auto" w:fill="F7F7F7"/>
             <w:tcMar>
-              <w:top w:w="55" w:type="dxa"/>
-              <w:left w:w="90" w:type="dxa"/>
-              <w:bottom w:w="55" w:type="dxa"/>
-              <w:right w:w="90" w:type="dxa"/>
+              <w:top w:w="48" w:type="dxa"/>
+              <w:left w:w="85" w:type="dxa"/>
+              <w:bottom w:w="48" w:type="dxa"/>
+              <w:right w:w="85" w:type="dxa"/>
             </w:tcMar>
           </w:tcPr>
           <w:p>
@@ -1132,15 +1103,14 @@
                 <w:rFonts w:cs="Times New Roman"/>
                 <w:b/>
                 <w:color w:val="000000"/>
-                <w:sz w:val="22"/>
               </w:rPr>
-              <w:t>Project Title</w:t>
+              <w:t>Name / Title of Project</w:t>
             </w:r>
           </w:p>
         </w:tc>
         <w:tc>
           <w:tcPr>
-            <w:tcW w:w="6179" w:type="dxa"/>
+            <w:tcW w:w="5499" w:type="dxa"/>
             <w:tcBorders>
               <w:top w:val="single" w:sz="4" w:space="0" w:color="000000"/>
               <w:left w:val="single" w:sz="4" w:space="0" w:color="000000"/>
@@ -1148,10 +1118,10 @@
               <w:right w:val="single" w:sz="4" w:space="0" w:color="000000"/>
             </w:tcBorders>
             <w:tcMar>
-              <w:top w:w="55" w:type="dxa"/>
-              <w:left w:w="90" w:type="dxa"/>
-              <w:bottom w:w="55" w:type="dxa"/>
-              <w:right w:w="90" w:type="dxa"/>
+              <w:top w:w="48" w:type="dxa"/>
+              <w:left w:w="85" w:type="dxa"/>
+              <w:bottom w:w="48" w:type="dxa"/>
+              <w:right w:w="85" w:type="dxa"/>
             </w:tcMar>
           </w:tcPr>
           <w:p>
@@ -1162,7 +1132,6 @@
               <w:rPr>
                 <w:rFonts w:cs="Times New Roman"/>
                 <w:color w:val="000000"/>
-                <w:sz w:val="22"/>
               </w:rPr>
               <w:t>Automated Expenditure Tracker with QR-Integrated Payment Gateway Log Analysis</w:t>
             </w:r>
@@ -1175,7 +1144,7 @@
         </w:trPr>
         <w:tc>
           <w:tcPr>
-            <w:tcW w:w="2381" w:type="dxa"/>
+            <w:tcW w:w="3061" w:type="dxa"/>
             <w:tcBorders>
               <w:top w:val="single" w:sz="4" w:space="0" w:color="000000"/>
               <w:left w:val="single" w:sz="4" w:space="0" w:color="000000"/>
@@ -1184,10 +1153,10 @@
             </w:tcBorders>
             <w:shd w:val="clear" w:color="auto" w:fill="F7F7F7"/>
             <w:tcMar>
-              <w:top w:w="55" w:type="dxa"/>
-              <w:left w:w="90" w:type="dxa"/>
-              <w:bottom w:w="55" w:type="dxa"/>
-              <w:right w:w="90" w:type="dxa"/>
+              <w:top w:w="48" w:type="dxa"/>
+              <w:left w:w="85" w:type="dxa"/>
+              <w:bottom w:w="48" w:type="dxa"/>
+              <w:right w:w="85" w:type="dxa"/>
             </w:tcMar>
           </w:tcPr>
           <w:p>
@@ -1199,15 +1168,14 @@
                 <w:rFonts w:cs="Times New Roman"/>
                 <w:b/>
                 <w:color w:val="000000"/>
-                <w:sz w:val="22"/>
               </w:rPr>
-              <w:t>Degree &amp; Branch</w:t>
+              <w:t>Degree &amp; Semester</w:t>
             </w:r>
           </w:p>
         </w:tc>
         <w:tc>
           <w:tcPr>
-            <w:tcW w:w="6179" w:type="dxa"/>
+            <w:tcW w:w="5499" w:type="dxa"/>
             <w:tcBorders>
               <w:top w:val="single" w:sz="4" w:space="0" w:color="000000"/>
               <w:left w:val="single" w:sz="4" w:space="0" w:color="000000"/>
@@ -1215,10 +1183,10 @@
               <w:right w:val="single" w:sz="4" w:space="0" w:color="000000"/>
             </w:tcBorders>
             <w:tcMar>
-              <w:top w:w="55" w:type="dxa"/>
-              <w:left w:w="90" w:type="dxa"/>
-              <w:bottom w:w="55" w:type="dxa"/>
-              <w:right w:w="90" w:type="dxa"/>
+              <w:top w:w="48" w:type="dxa"/>
+              <w:left w:w="85" w:type="dxa"/>
+              <w:bottom w:w="48" w:type="dxa"/>
+              <w:right w:w="85" w:type="dxa"/>
             </w:tcMar>
           </w:tcPr>
           <w:p>
@@ -1229,9 +1197,8 @@
               <w:rPr>
                 <w:rFonts w:cs="Times New Roman"/>
                 <w:color w:val="000000"/>
-                <w:sz w:val="22"/>
               </w:rPr>
-              <w:t>B.Tech in Computer Science &amp; Engineering (7th Semester, Session 2026-27)</w:t>
+              <w:t>B.Tech in Computer Science &amp; Engineering (7th Semester, Final Year)</w:t>
             </w:r>
           </w:p>
         </w:tc>
@@ -1242,7 +1209,7 @@
         </w:trPr>
         <w:tc>
           <w:tcPr>
-            <w:tcW w:w="2381" w:type="dxa"/>
+            <w:tcW w:w="3061" w:type="dxa"/>
             <w:tcBorders>
               <w:top w:val="single" w:sz="4" w:space="0" w:color="000000"/>
               <w:left w:val="single" w:sz="4" w:space="0" w:color="000000"/>
@@ -1251,10 +1218,10 @@
             </w:tcBorders>
             <w:shd w:val="clear" w:color="auto" w:fill="F7F7F7"/>
             <w:tcMar>
-              <w:top w:w="55" w:type="dxa"/>
-              <w:left w:w="90" w:type="dxa"/>
-              <w:bottom w:w="55" w:type="dxa"/>
-              <w:right w:w="90" w:type="dxa"/>
+              <w:top w:w="48" w:type="dxa"/>
+              <w:left w:w="85" w:type="dxa"/>
+              <w:bottom w:w="48" w:type="dxa"/>
+              <w:right w:w="85" w:type="dxa"/>
             </w:tcMar>
           </w:tcPr>
           <w:p>
@@ -1266,15 +1233,14 @@
                 <w:rFonts w:cs="Times New Roman"/>
                 <w:b/>
                 <w:color w:val="000000"/>
-                <w:sz w:val="22"/>
               </w:rPr>
-              <w:t>Institution</w:t>
+              <w:t>Project Supervisor</w:t>
             </w:r>
           </w:p>
         </w:tc>
         <w:tc>
           <w:tcPr>
-            <w:tcW w:w="6179" w:type="dxa"/>
+            <w:tcW w:w="5499" w:type="dxa"/>
             <w:tcBorders>
               <w:top w:val="single" w:sz="4" w:space="0" w:color="000000"/>
               <w:left w:val="single" w:sz="4" w:space="0" w:color="000000"/>
@@ -1282,10 +1248,10 @@
               <w:right w:val="single" w:sz="4" w:space="0" w:color="000000"/>
             </w:tcBorders>
             <w:tcMar>
-              <w:top w:w="55" w:type="dxa"/>
-              <w:left w:w="90" w:type="dxa"/>
-              <w:bottom w:w="55" w:type="dxa"/>
-              <w:right w:w="90" w:type="dxa"/>
+              <w:top w:w="48" w:type="dxa"/>
+              <w:left w:w="85" w:type="dxa"/>
+              <w:bottom w:w="48" w:type="dxa"/>
+              <w:right w:w="85" w:type="dxa"/>
             </w:tcMar>
           </w:tcPr>
           <w:p>
@@ -1296,7 +1262,71 @@
               <w:rPr>
                 <w:rFonts w:cs="Times New Roman"/>
                 <w:color w:val="000000"/>
-                <w:sz w:val="22"/>
+              </w:rPr>
+              <w:t>Dr. A. P. Srivastava</w:t>
+            </w:r>
+          </w:p>
+        </w:tc>
+      </w:tr>
+      <w:tr>
+        <w:trPr>
+          <w:jc w:val="center"/>
+        </w:trPr>
+        <w:tc>
+          <w:tcPr>
+            <w:tcW w:w="3061" w:type="dxa"/>
+            <w:tcBorders>
+              <w:top w:val="single" w:sz="4" w:space="0" w:color="000000"/>
+              <w:left w:val="single" w:sz="4" w:space="0" w:color="000000"/>
+              <w:bottom w:val="single" w:sz="4" w:space="0" w:color="000000"/>
+              <w:right w:val="single" w:sz="4" w:space="0" w:color="000000"/>
+            </w:tcBorders>
+            <w:shd w:val="clear" w:color="auto" w:fill="F7F7F7"/>
+            <w:tcMar>
+              <w:top w:w="48" w:type="dxa"/>
+              <w:left w:w="85" w:type="dxa"/>
+              <w:bottom w:w="48" w:type="dxa"/>
+              <w:right w:w="85" w:type="dxa"/>
+            </w:tcMar>
+          </w:tcPr>
+          <w:p>
+            <w:pPr>
+              <w:spacing w:before="20" w:after="20"/>
+            </w:pPr>
+            <w:r>
+              <w:rPr>
+                <w:rFonts w:cs="Times New Roman"/>
+                <w:b/>
+                <w:color w:val="000000"/>
+              </w:rPr>
+              <w:t>Institution &amp; University</w:t>
+            </w:r>
+          </w:p>
+        </w:tc>
+        <w:tc>
+          <w:tcPr>
+            <w:tcW w:w="5499" w:type="dxa"/>
+            <w:tcBorders>
+              <w:top w:val="single" w:sz="4" w:space="0" w:color="000000"/>
+              <w:left w:val="single" w:sz="4" w:space="0" w:color="000000"/>
+              <w:bottom w:val="single" w:sz="4" w:space="0" w:color="000000"/>
+              <w:right w:val="single" w:sz="4" w:space="0" w:color="000000"/>
+            </w:tcBorders>
+            <w:tcMar>
+              <w:top w:w="48" w:type="dxa"/>
+              <w:left w:w="85" w:type="dxa"/>
+              <w:bottom w:w="48" w:type="dxa"/>
+              <w:right w:w="85" w:type="dxa"/>
+            </w:tcMar>
+          </w:tcPr>
+          <w:p>
+            <w:pPr>
+              <w:spacing w:before="20" w:after="20"/>
+            </w:pPr>
+            <w:r>
+              <w:rPr>
+                <w:rFonts w:cs="Times New Roman"/>
+                <w:color w:val="000000"/>
               </w:rPr>
               <w:t>NITRA Technical Campus, Ghaziabad (Dr. A.P.J. Abdul Kalam Technical University)</w:t>
             </w:r>
@@ -1309,7 +1339,7 @@
         </w:trPr>
         <w:tc>
           <w:tcPr>
-            <w:tcW w:w="2381" w:type="dxa"/>
+            <w:tcW w:w="3061" w:type="dxa"/>
             <w:tcBorders>
               <w:top w:val="single" w:sz="4" w:space="0" w:color="000000"/>
               <w:left w:val="single" w:sz="4" w:space="0" w:color="000000"/>
@@ -1318,10 +1348,10 @@
             </w:tcBorders>
             <w:shd w:val="clear" w:color="auto" w:fill="F7F7F7"/>
             <w:tcMar>
-              <w:top w:w="55" w:type="dxa"/>
-              <w:left w:w="90" w:type="dxa"/>
-              <w:bottom w:w="55" w:type="dxa"/>
-              <w:right w:w="90" w:type="dxa"/>
+              <w:top w:w="48" w:type="dxa"/>
+              <w:left w:w="85" w:type="dxa"/>
+              <w:bottom w:w="48" w:type="dxa"/>
+              <w:right w:w="85" w:type="dxa"/>
             </w:tcMar>
           </w:tcPr>
           <w:p>
@@ -1333,15 +1363,14 @@
                 <w:rFonts w:cs="Times New Roman"/>
                 <w:b/>
                 <w:color w:val="000000"/>
-                <w:sz w:val="22"/>
               </w:rPr>
-              <w:t>Domain &amp; Stack</w:t>
+              <w:t>Anuj Kushwaha (2308020100017)</w:t>
             </w:r>
           </w:p>
         </w:tc>
         <w:tc>
           <w:tcPr>
-            <w:tcW w:w="6179" w:type="dxa"/>
+            <w:tcW w:w="5499" w:type="dxa"/>
             <w:tcBorders>
               <w:top w:val="single" w:sz="4" w:space="0" w:color="000000"/>
               <w:left w:val="single" w:sz="4" w:space="0" w:color="000000"/>
@@ -1349,10 +1378,10 @@
               <w:right w:val="single" w:sz="4" w:space="0" w:color="000000"/>
             </w:tcBorders>
             <w:tcMar>
-              <w:top w:w="55" w:type="dxa"/>
-              <w:left w:w="90" w:type="dxa"/>
-              <w:bottom w:w="55" w:type="dxa"/>
-              <w:right w:w="90" w:type="dxa"/>
+              <w:top w:w="48" w:type="dxa"/>
+              <w:left w:w="85" w:type="dxa"/>
+              <w:bottom w:w="48" w:type="dxa"/>
+              <w:right w:w="85" w:type="dxa"/>
             </w:tcMar>
           </w:tcPr>
           <w:p>
@@ -1363,9 +1392,8 @@
               <w:rPr>
                 <w:rFonts w:cs="Times New Roman"/>
                 <w:color w:val="000000"/>
-                <w:sz w:val="22"/>
               </w:rPr>
-              <w:t>Data Science &amp; Analytics | Python 3.11+, Flet 1.0+, SQLite3 / SQLCipher, PyJNIus</w:t>
+              <w:t>Backend Database Architecture, NPCI UPI 2.0 URI Parser &amp; Android OS Intent Bridge</w:t>
             </w:r>
           </w:p>
         </w:tc>
@@ -1376,7 +1404,7 @@
         </w:trPr>
         <w:tc>
           <w:tcPr>
-            <w:tcW w:w="2381" w:type="dxa"/>
+            <w:tcW w:w="3061" w:type="dxa"/>
             <w:tcBorders>
               <w:top w:val="single" w:sz="4" w:space="0" w:color="000000"/>
               <w:left w:val="single" w:sz="4" w:space="0" w:color="000000"/>
@@ -1385,10 +1413,10 @@
             </w:tcBorders>
             <w:shd w:val="clear" w:color="auto" w:fill="F7F7F7"/>
             <w:tcMar>
-              <w:top w:w="55" w:type="dxa"/>
-              <w:left w:w="90" w:type="dxa"/>
-              <w:bottom w:w="55" w:type="dxa"/>
-              <w:right w:w="90" w:type="dxa"/>
+              <w:top w:w="48" w:type="dxa"/>
+              <w:left w:w="85" w:type="dxa"/>
+              <w:bottom w:w="48" w:type="dxa"/>
+              <w:right w:w="85" w:type="dxa"/>
             </w:tcMar>
           </w:tcPr>
           <w:p>
@@ -1400,15 +1428,14 @@
                 <w:rFonts w:cs="Times New Roman"/>
                 <w:b/>
                 <w:color w:val="000000"/>
-                <w:sz w:val="22"/>
               </w:rPr>
-              <w:t>Sumit Kushwaha</w:t>
+              <w:t>Saurabh Yadav (2308020100085)</w:t>
             </w:r>
           </w:p>
         </w:tc>
         <w:tc>
           <w:tcPr>
-            <w:tcW w:w="6179" w:type="dxa"/>
+            <w:tcW w:w="5499" w:type="dxa"/>
             <w:tcBorders>
               <w:top w:val="single" w:sz="4" w:space="0" w:color="000000"/>
               <w:left w:val="single" w:sz="4" w:space="0" w:color="000000"/>
@@ -1416,10 +1443,10 @@
               <w:right w:val="single" w:sz="4" w:space="0" w:color="000000"/>
             </w:tcBorders>
             <w:tcMar>
-              <w:top w:w="55" w:type="dxa"/>
-              <w:left w:w="90" w:type="dxa"/>
-              <w:bottom w:w="55" w:type="dxa"/>
-              <w:right w:w="90" w:type="dxa"/>
+              <w:top w:w="48" w:type="dxa"/>
+              <w:left w:w="85" w:type="dxa"/>
+              <w:bottom w:w="48" w:type="dxa"/>
+              <w:right w:w="85" w:type="dxa"/>
             </w:tcMar>
           </w:tcPr>
           <w:p>
@@ -1430,9 +1457,8 @@
               <w:rPr>
                 <w:rFonts w:cs="Times New Roman"/>
                 <w:color w:val="000000"/>
-                <w:sz w:val="22"/>
               </w:rPr>
-              <w:t>Project Lead, Git &amp; Agile Coordinator, Contract Bridge (main.py, src/contracts.py)</w:t>
+              <w:t>Frontend Mobile UI/UX, QR Scanner Viewfinder &amp; Interactive Financial Dashboard</w:t>
             </w:r>
           </w:p>
         </w:tc>
@@ -1443,7 +1469,7 @@
         </w:trPr>
         <w:tc>
           <w:tcPr>
-            <w:tcW w:w="2381" w:type="dxa"/>
+            <w:tcW w:w="3061" w:type="dxa"/>
             <w:tcBorders>
               <w:top w:val="single" w:sz="4" w:space="0" w:color="000000"/>
               <w:left w:val="single" w:sz="4" w:space="0" w:color="000000"/>
@@ -1452,10 +1478,10 @@
             </w:tcBorders>
             <w:shd w:val="clear" w:color="auto" w:fill="F7F7F7"/>
             <w:tcMar>
-              <w:top w:w="55" w:type="dxa"/>
-              <w:left w:w="90" w:type="dxa"/>
-              <w:bottom w:w="55" w:type="dxa"/>
-              <w:right w:w="90" w:type="dxa"/>
+              <w:top w:w="48" w:type="dxa"/>
+              <w:left w:w="85" w:type="dxa"/>
+              <w:bottom w:w="48" w:type="dxa"/>
+              <w:right w:w="85" w:type="dxa"/>
             </w:tcMar>
           </w:tcPr>
           <w:p>
@@ -1467,15 +1493,14 @@
                 <w:rFonts w:cs="Times New Roman"/>
                 <w:b/>
                 <w:color w:val="000000"/>
-                <w:sz w:val="22"/>
               </w:rPr>
-              <w:t>Anuj Kushwaha</w:t>
+              <w:t>Sumit Kushwaha (2308020100098)</w:t>
             </w:r>
           </w:p>
         </w:tc>
         <w:tc>
           <w:tcPr>
-            <w:tcW w:w="6179" w:type="dxa"/>
+            <w:tcW w:w="5499" w:type="dxa"/>
             <w:tcBorders>
               <w:top w:val="single" w:sz="4" w:space="0" w:color="000000"/>
               <w:left w:val="single" w:sz="4" w:space="0" w:color="000000"/>
@@ -1483,10 +1508,10 @@
               <w:right w:val="single" w:sz="4" w:space="0" w:color="000000"/>
             </w:tcBorders>
             <w:tcMar>
-              <w:top w:w="55" w:type="dxa"/>
-              <w:left w:w="90" w:type="dxa"/>
-              <w:bottom w:w="55" w:type="dxa"/>
-              <w:right w:w="90" w:type="dxa"/>
+              <w:top w:w="48" w:type="dxa"/>
+              <w:left w:w="85" w:type="dxa"/>
+              <w:bottom w:w="48" w:type="dxa"/>
+              <w:right w:w="85" w:type="dxa"/>
             </w:tcMar>
           </w:tcPr>
           <w:p>
@@ -1497,9 +1522,8 @@
               <w:rPr>
                 <w:rFonts w:cs="Times New Roman"/>
                 <w:color w:val="000000"/>
-                <w:sz w:val="22"/>
               </w:rPr>
-              <w:t>Backend Developer — SQLite v1.1 CRUD, Signed UPI 2.0 URI &amp; PyJNIus Bridge</w:t>
+              <w:t>System Architecture, Core Module Integration &amp; Hybrid Verification Workflow</w:t>
             </w:r>
           </w:p>
         </w:tc>
@@ -1510,7 +1534,7 @@
         </w:trPr>
         <w:tc>
           <w:tcPr>
-            <w:tcW w:w="2381" w:type="dxa"/>
+            <w:tcW w:w="3061" w:type="dxa"/>
             <w:tcBorders>
               <w:top w:val="single" w:sz="4" w:space="0" w:color="000000"/>
               <w:left w:val="single" w:sz="4" w:space="0" w:color="000000"/>
@@ -1519,10 +1543,10 @@
             </w:tcBorders>
             <w:shd w:val="clear" w:color="auto" w:fill="F7F7F7"/>
             <w:tcMar>
-              <w:top w:w="55" w:type="dxa"/>
-              <w:left w:w="90" w:type="dxa"/>
-              <w:bottom w:w="55" w:type="dxa"/>
-              <w:right w:w="90" w:type="dxa"/>
+              <w:top w:w="48" w:type="dxa"/>
+              <w:left w:w="85" w:type="dxa"/>
+              <w:bottom w:w="48" w:type="dxa"/>
+              <w:right w:w="85" w:type="dxa"/>
             </w:tcMar>
           </w:tcPr>
           <w:p>
@@ -1534,15 +1558,14 @@
                 <w:rFonts w:cs="Times New Roman"/>
                 <w:b/>
                 <w:color w:val="000000"/>
-                <w:sz w:val="22"/>
               </w:rPr>
-              <w:t>Saurabh Yadav</w:t>
+              <w:t>Uday Paswan (2308020100102)</w:t>
             </w:r>
           </w:p>
         </w:tc>
         <w:tc>
           <w:tcPr>
-            <w:tcW w:w="6179" w:type="dxa"/>
+            <w:tcW w:w="5499" w:type="dxa"/>
             <w:tcBorders>
               <w:top w:val="single" w:sz="4" w:space="0" w:color="000000"/>
               <w:left w:val="single" w:sz="4" w:space="0" w:color="000000"/>
@@ -1550,10 +1573,10 @@
               <w:right w:val="single" w:sz="4" w:space="0" w:color="000000"/>
             </w:tcBorders>
             <w:tcMar>
-              <w:top w:w="55" w:type="dxa"/>
-              <w:left w:w="90" w:type="dxa"/>
-              <w:bottom w:w="55" w:type="dxa"/>
-              <w:right w:w="90" w:type="dxa"/>
+              <w:top w:w="48" w:type="dxa"/>
+              <w:left w:w="85" w:type="dxa"/>
+              <w:bottom w:w="48" w:type="dxa"/>
+              <w:right w:w="85" w:type="dxa"/>
             </w:tcMar>
           </w:tcPr>
           <w:p>
@@ -1564,76 +1587,8 @@
               <w:rPr>
                 <w:rFonts w:cs="Times New Roman"/>
                 <w:color w:val="000000"/>
-                <w:sz w:val="22"/>
               </w:rPr>
-              <w:t>Frontend Developer — Python Flet Dark-Mode Mobile UI, Views &amp; Lifecycle Popups</w:t>
-            </w:r>
-          </w:p>
-        </w:tc>
-      </w:tr>
-      <w:tr>
-        <w:trPr>
-          <w:jc w:val="center"/>
-        </w:trPr>
-        <w:tc>
-          <w:tcPr>
-            <w:tcW w:w="2381" w:type="dxa"/>
-            <w:tcBorders>
-              <w:top w:val="single" w:sz="4" w:space="0" w:color="000000"/>
-              <w:left w:val="single" w:sz="4" w:space="0" w:color="000000"/>
-              <w:bottom w:val="single" w:sz="4" w:space="0" w:color="000000"/>
-              <w:right w:val="single" w:sz="4" w:space="0" w:color="000000"/>
-            </w:tcBorders>
-            <w:shd w:val="clear" w:color="auto" w:fill="F7F7F7"/>
-            <w:tcMar>
-              <w:top w:w="55" w:type="dxa"/>
-              <w:left w:w="90" w:type="dxa"/>
-              <w:bottom w:w="55" w:type="dxa"/>
-              <w:right w:w="90" w:type="dxa"/>
-            </w:tcMar>
-          </w:tcPr>
-          <w:p>
-            <w:pPr>
-              <w:spacing w:before="20" w:after="20"/>
-            </w:pPr>
-            <w:r>
-              <w:rPr>
-                <w:rFonts w:cs="Times New Roman"/>
-                <w:b/>
-                <w:color w:val="000000"/>
-                <w:sz w:val="22"/>
-              </w:rPr>
-              <w:t>Uday Paswan</w:t>
-            </w:r>
-          </w:p>
-        </w:tc>
-        <w:tc>
-          <w:tcPr>
-            <w:tcW w:w="6179" w:type="dxa"/>
-            <w:tcBorders>
-              <w:top w:val="single" w:sz="4" w:space="0" w:color="000000"/>
-              <w:left w:val="single" w:sz="4" w:space="0" w:color="000000"/>
-              <w:bottom w:val="single" w:sz="4" w:space="0" w:color="000000"/>
-              <w:right w:val="single" w:sz="4" w:space="0" w:color="000000"/>
-            </w:tcBorders>
-            <w:tcMar>
-              <w:top w:w="55" w:type="dxa"/>
-              <w:left w:w="90" w:type="dxa"/>
-              <w:bottom w:w="55" w:type="dxa"/>
-              <w:right w:w="90" w:type="dxa"/>
-            </w:tcMar>
-          </w:tcPr>
-          <w:p>
-            <w:pPr>
-              <w:spacing w:before="20" w:after="20"/>
-            </w:pPr>
-            <w:r>
-              <w:rPr>
-                <w:rFonts w:cs="Times New Roman"/>
-                <w:color w:val="000000"/>
-                <w:sz w:val="22"/>
-              </w:rPr>
-              <w:t>Data Analyst — 3-Tier Regex Tagger, Safe Z-Score Anomaly &amp; Health Score Engine</w:t>
+              <w:t>Data Science &amp; Analytics — 3-Tier NLP Regex Tagger &amp; Statistical Z-Score Engine</w:t>
             </w:r>
           </w:p>
         </w:tc>
@@ -1647,7 +1602,7 @@
     <w:p>
       <w:pPr>
         <w:keepNext/>
-        <w:spacing w:before="200"/>
+        <w:spacing w:before="160"/>
       </w:pPr>
       <w:r>
         <w:rPr>
@@ -1662,7 +1617,7 @@
     </w:p>
     <w:p>
       <w:pPr>
-        <w:spacing w:after="90"/>
+        <w:spacing w:after="76"/>
         <w:jc w:val="both"/>
       </w:pPr>
       <w:r>
@@ -1677,20 +1632,25 @@
       <w:pPr>
         <w:keepNext/>
         <w:spacing w:before="120" w:after="60"/>
+        <w:rPr>
+          <w:b/>
+          <w:bCs/>
+        </w:rPr>
       </w:pPr>
       <w:r>
         <w:rPr>
           <w:rFonts w:cs="Times New Roman"/>
           <w:b/>
+          <w:bCs/>
           <w:i/>
           <w:color w:val="000000"/>
         </w:rPr>
-        <w:t>1.1 Key Technical Failures in Existing Expense Tracking Solutions</w:t>
+        <w:t>1.1 Key Technical Limitations in Existing Expense Tracking Solutions</w:t>
       </w:r>
     </w:p>
     <w:p>
       <w:pPr>
-        <w:spacing w:after="90"/>
+        <w:spacing w:after="76"/>
         <w:jc w:val="both"/>
       </w:pPr>
       <w:r>
@@ -1698,12 +1658,12 @@
           <w:rFonts w:cs="Times New Roman"/>
           <w:color w:val="000000"/>
         </w:rPr>
-        <w:t>Existing personal finance and expense management applications in the Indian market suffer from five fundamental architectural and privacy limitations that prevent reliable, real-time expense tracking:</w:t>
+        <w:t>Existing personal finance and expense management applications in the market suffer from five fundamental architectural and privacy limitations that prevent reliable, real-time expense tracking:</w:t>
       </w:r>
     </w:p>
     <w:p>
       <w:pPr>
-        <w:spacing w:after="60"/>
+        <w:spacing w:after="44"/>
         <w:ind w:left="397" w:hanging="227"/>
         <w:jc w:val="both"/>
       </w:pPr>
@@ -1720,12 +1680,12 @@
           <w:rFonts w:cs="Times New Roman"/>
           <w:color w:val="000000"/>
         </w:rPr>
-        <w:t>Legacy applications (such as Walnut/Axio) rely on reading inbox SMS alerts. Modern Android versions (Android 13–15) enforce strict runtime restrictions against READ_SMS permissions, and Indian banks increasingly replace low-value UPI SMS alerts with in-app push notifications, causing SMS trackers to miss up to 40% of daily micro-payments.</w:t>
+        <w:t>Legacy applications (such as Walnut/Axio) rely on reading inbox SMS alerts. Modern Android versions (Android 13–15) enforce strict runtime restrictions against READ_SMS permissions, and banks increasingly replace low-value UPI SMS alerts with in-app push notifications, causing SMS trackers to miss up to 40% of daily micro-payments.</w:t>
       </w:r>
     </w:p>
     <w:p>
       <w:pPr>
-        <w:spacing w:after="60"/>
+        <w:spacing w:after="44"/>
         <w:ind w:left="397" w:hanging="227"/>
         <w:jc w:val="both"/>
       </w:pPr>
@@ -1747,7 +1707,7 @@
     </w:p>
     <w:p>
       <w:pPr>
-        <w:spacing w:after="60"/>
+        <w:spacing w:after="44"/>
         <w:ind w:left="397" w:hanging="227"/>
         <w:jc w:val="both"/>
       </w:pPr>
@@ -1764,12 +1724,12 @@
           <w:rFonts w:cs="Times New Roman"/>
           <w:color w:val="000000"/>
         </w:rPr>
-        <w:t>When an expense tracker launches an external UPI application via an Android Intent on devices with 4GB–6GB RAM, the Android Low Memory Killer (LMK) frequently terminates the background tracker process. Furthermore, several UPI apps return 'RESULT_CANCELED' or strip the 'txnId' from person-to-person (P2P) callback payloads, resulting in permanent loss of transaction logs.</w:t>
+        <w:t>When an expense tracker launches an external UPI application via an Android Intent on devices with limited RAM, the Android Low Memory Killer (LMK) frequently terminates the background tracker process. Furthermore, several UPI apps return 'RESULT_CANCELED' or strip the 'txnId' from person-to-person (P2P) callback payloads, resulting in permanent loss of transaction logs.</w:t>
       </w:r>
     </w:p>
     <w:p>
       <w:pPr>
-        <w:spacing w:after="60"/>
+        <w:spacing w:after="44"/>
         <w:ind w:left="397" w:hanging="227"/>
         <w:jc w:val="both"/>
       </w:pPr>
@@ -1791,7 +1751,7 @@
     </w:p>
     <w:p>
       <w:pPr>
-        <w:spacing w:after="60"/>
+        <w:spacing w:after="44"/>
         <w:ind w:left="397" w:hanging="227"/>
         <w:jc w:val="both"/>
       </w:pPr>
@@ -1808,13 +1768,29 @@
           <w:rFonts w:cs="Times New Roman"/>
           <w:color w:val="000000"/>
         </w:rPr>
-        <w:t>Commercial expense apps upload sensitive financial logs to external cloud servers for categorization. Additionally, naive Z-Score anomaly detectors divide by standard deviation ('stdev') without guarding against fixed-price recurring categories (such as identical Rs. 60 metro rides where 'stdev == 0'), causing unhandled ZeroDivisionError crashes.</w:t>
+        <w:t xml:space="preserve">Commercial expense apps upload sensitive financial logs to external cloud servers for categorization. Additionally, naive Z-Score anomaly detectors divide by standard deviation ('stdev') without guarding against fixed-price recurring categories (such as identical metro fares where 'stdev == 0'), causing unhandled </w:t>
+      </w:r>
+      <w:proofErr w:type="spellStart"/>
+      <w:r>
+        <w:rPr>
+          <w:rFonts w:cs="Times New Roman"/>
+          <w:color w:val="000000"/>
+        </w:rPr>
+        <w:t>ZeroDivisionError</w:t>
+      </w:r>
+      <w:proofErr w:type="spellEnd"/>
+      <w:r>
+        <w:rPr>
+          <w:rFonts w:cs="Times New Roman"/>
+          <w:color w:val="000000"/>
+        </w:rPr>
+        <w:t xml:space="preserve"> crashes.</w:t>
       </w:r>
     </w:p>
     <w:p>
       <w:pPr>
         <w:keepNext/>
-        <w:spacing w:before="200"/>
+        <w:spacing w:before="160"/>
       </w:pPr>
       <w:r>
         <w:rPr>
@@ -1828,7 +1804,7 @@
     </w:p>
     <w:p>
       <w:pPr>
-        <w:spacing w:after="90"/>
+        <w:spacing w:after="76"/>
         <w:jc w:val="both"/>
       </w:pPr>
       <w:r>
@@ -1836,7 +1812,7 @@
           <w:rFonts w:cs="Times New Roman"/>
           <w:color w:val="000000"/>
         </w:rPr>
-        <w:t>This project topic was chosen to bridge the gap between seamless UPI 2.0 payment execution and real-time, privacy-preserving personal financial analytics on edge mobile devices. Instead of relying on deprecated SMS scraping or intrusive bank-account aggregation, our system positions itself at the exact point of transaction initiation—</w:t>
+        <w:t xml:space="preserve">This project topic was chosen to bridge the gap between seamless UPI 2.0 payment execution and real-time, privacy-preserving personal financial analytics on edge mobile devices. Instead of relying on deprecated SMS scraping or intrusive bank-account aggregation, the proposed system positions itself at the exact point of transaction </w:t>
       </w:r>
       <w:r>
         <w:rPr>
@@ -1844,18 +1820,23 @@
           <w:color w:val="000000"/>
         </w:rPr>
         <w:lastRenderedPageBreak/>
-        <w:t>acting as an intelligent, lightweight QR-Integrated Payment Gateway Launcher and Local Log Analyzer.</w:t>
+        <w:t>initiation—acting as an intelligent, lightweight QR-Integrated Payment Gateway Launcher and Local Log Analyzer.</w:t>
       </w:r>
     </w:p>
     <w:p>
       <w:pPr>
         <w:keepNext/>
         <w:spacing w:before="120" w:after="60"/>
+        <w:rPr>
+          <w:b/>
+          <w:bCs/>
+        </w:rPr>
       </w:pPr>
       <w:r>
         <w:rPr>
           <w:rFonts w:cs="Times New Roman"/>
           <w:b/>
+          <w:bCs/>
           <w:i/>
           <w:color w:val="000000"/>
         </w:rPr>
@@ -1864,7 +1845,7 @@
     </w:p>
     <w:p>
       <w:pPr>
-        <w:spacing w:after="90"/>
+        <w:spacing w:after="76"/>
         <w:jc w:val="both"/>
       </w:pPr>
       <w:r>
@@ -1872,18 +1853,23 @@
           <w:rFonts w:cs="Times New Roman"/>
           <w:color w:val="000000"/>
         </w:rPr>
-        <w:t>A core motivation for choosing this topic is demonstrating that real-time mobile Data Science is achieved through algorithmic efficiency and statistical rigor rather than brute-force library bloat. By engineering our analytics engine using exclusively Python's standard library ('re', 'statistics', 'math', 'sqlite3', and 'csv') without Pandas or Scikit-learn, our system achieves sub-millisecond (&lt;1 ms) merchant categorization latency and &lt;500 ms application warm-resume speed within a compact 25–35 MB APK.</w:t>
+        <w:t>A core motivation for choosing this topic is demonstrating that real-time mobile Data Science is achieved through algorithmic efficiency and statistical rigor rather than brute-force library bloat. By engineering the analytics engine using exclusively Python's standard mathematical and text-processing modules ('re', 'statistics', 'math', 'sqlite3', and 'csv') without Pandas or Scikit-learn, the system achieves sub-millisecond (&lt;1 ms) merchant categorization latency and &lt;500 ms application warm-resume speed within a compact 25–35 MB mobile package.</w:t>
       </w:r>
     </w:p>
     <w:p>
       <w:pPr>
         <w:keepNext/>
         <w:spacing w:before="120" w:after="60"/>
+        <w:rPr>
+          <w:b/>
+          <w:bCs/>
+        </w:rPr>
       </w:pPr>
       <w:r>
         <w:rPr>
           <w:rFonts w:cs="Times New Roman"/>
           <w:b/>
+          <w:bCs/>
           <w:i/>
           <w:color w:val="000000"/>
         </w:rPr>
@@ -1892,7 +1878,7 @@
     </w:p>
     <w:p>
       <w:pPr>
-        <w:spacing w:after="90"/>
+        <w:spacing w:after="76"/>
         <w:jc w:val="both"/>
       </w:pPr>
       <w:r>
@@ -1906,7 +1892,7 @@
     <w:p>
       <w:pPr>
         <w:keepNext/>
-        <w:spacing w:before="200"/>
+        <w:spacing w:before="160"/>
       </w:pPr>
       <w:r>
         <w:rPr>
@@ -1922,11 +1908,16 @@
       <w:pPr>
         <w:keepNext/>
         <w:spacing w:before="120" w:after="60"/>
+        <w:rPr>
+          <w:b/>
+          <w:bCs/>
+        </w:rPr>
       </w:pPr>
       <w:r>
         <w:rPr>
           <w:rFonts w:cs="Times New Roman"/>
           <w:b/>
+          <w:bCs/>
           <w:i/>
           <w:color w:val="000000"/>
         </w:rPr>
@@ -1935,7 +1926,7 @@
     </w:p>
     <w:p>
       <w:pPr>
-        <w:spacing w:after="90"/>
+        <w:spacing w:after="76"/>
         <w:jc w:val="both"/>
       </w:pPr>
       <w:r>
@@ -1948,7 +1939,7 @@
     </w:p>
     <w:p>
       <w:pPr>
-        <w:spacing w:after="60"/>
+        <w:spacing w:after="44"/>
         <w:ind w:left="397" w:hanging="227"/>
         <w:jc w:val="both"/>
       </w:pPr>
@@ -1965,12 +1956,12 @@
           <w:rFonts w:cs="Times New Roman"/>
           <w:color w:val="000000"/>
         </w:rPr>
-        <w:t>Develop a pure-Python URI parser ('build_signed_upi_uri') using 'urllib.parse.urlsplit' and 'parse_qsl' that preserves all cryptographic merchant parameters ('pa', 'pn', 'mc', 'tid', 'tr', 'sign', 'orgid', 'mode') while injecting transaction amount ('am' formatted to 2 decimal places) and currency ('cu=INR') without double-encoding '@' or ':' characters.</w:t>
+        <w:t>Develop a lossless URI parser using 'urllib.parse.urlsplit' and 'parse_qsl' that preserves all cryptographic merchant parameters ('pa', 'pn', 'mc', 'tid', 'tr', 'sign', 'orgid', 'mode') while injecting transaction amount ('am' formatted to 2 decimal places) and currency ('cu=INR') without corrupting '@' or ':' characters.</w:t>
       </w:r>
     </w:p>
     <w:p>
       <w:pPr>
-        <w:spacing w:after="60"/>
+        <w:spacing w:after="44"/>
         <w:ind w:left="397" w:hanging="227"/>
         <w:jc w:val="both"/>
       </w:pPr>
@@ -1987,12 +1978,12 @@
           <w:rFonts w:cs="Times New Roman"/>
           <w:color w:val="000000"/>
         </w:rPr>
-        <w:t>Combine native Android 'onActivityResult' callback parsing (via PyJNIus) with a deterministic 1-Tap Resume Verification Fallback Popup triggered on Flet's 'RESUME' lifecycle state whenever unresolved rows exist in 'pending_transactions' ('WHERE internal_id = ?').</w:t>
+        <w:t>Combine native Android 'onActivityResult' callback parsing (via PyJNIus) with a deterministic 1-Tap Resume Verification Fallback Popup triggered on app lifecycle resume whenever unresolved rows exist in 'pending_transactions'.</w:t>
       </w:r>
     </w:p>
     <w:p>
       <w:pPr>
-        <w:spacing w:after="60"/>
+        <w:spacing w:after="44"/>
         <w:ind w:left="397" w:hanging="227"/>
         <w:jc w:val="both"/>
       </w:pPr>
@@ -2009,12 +2000,12 @@
           <w:rFonts w:cs="Times New Roman"/>
           <w:color w:val="000000"/>
         </w:rPr>
-        <w:t>Classify Indian merchant VPAs and payee names across 6 core budget categories (Food &amp; Dining, Travel, Groceries, Fuel, Utilities, and Uncategorized) using Tier 1 SQLite cache lookup ('merchant_tags'), Tier 2 pre-compiled word-boundary Regex heuristics ('COMPILED_REGEX_RULES'), and Tier 3 interactive 1-Tap First-Time Merchant Tagging.</w:t>
+        <w:t>Classify Indian merchant VPAs and payee names across 6 core budget categories (Food &amp; Dining, Travel, Groceries, Fuel, Utilities, and Uncategorized) using Tier 1 SQLite cache lookup ('merchant_tags'), Tier 2 pre-compiled word-boundary Regex heuristics, and Tier 3 interactive 1-Tap First-Time Merchant Tagging.</w:t>
       </w:r>
     </w:p>
     <w:p>
       <w:pPr>
-        <w:spacing w:after="60"/>
+        <w:spacing w:after="44"/>
         <w:ind w:left="397" w:hanging="227"/>
         <w:jc w:val="both"/>
       </w:pPr>
@@ -2036,7 +2027,7 @@
     </w:p>
     <w:p>
       <w:pPr>
-        <w:spacing w:after="60"/>
+        <w:spacing w:after="44"/>
         <w:ind w:left="397" w:hanging="227"/>
         <w:jc w:val="both"/>
       </w:pPr>
@@ -2046,26 +2037,38 @@
           <w:b/>
           <w:color w:val="000000"/>
         </w:rPr>
-        <w:lastRenderedPageBreak/>
-        <w:t xml:space="preserve">• Objective 5 — Zero-Knowledge Local Security &amp; Social Bill Splitting: </w:t>
+        <w:t xml:space="preserve">• Objective 5 — Zero-Knowledge Local Security &amp; Peer Bill Splitting: </w:t>
       </w:r>
       <w:r>
         <w:rPr>
           <w:rFonts w:cs="Times New Roman"/>
           <w:color w:val="000000"/>
         </w:rPr>
-        <w:t>Persist all data across 6 normalized SQLite v1.1 tables encrypted via SQLCipher 256-bit AES with Android Biometric unlock, while supporting 3-second post-payment quick tagging and peer bill splitting ('bill_splits' table).</w:t>
+        <w:t xml:space="preserve">Persist all data across 6 normalized SQLite tables encrypted via SQLCipher 256-bit AES with </w:t>
+      </w:r>
+      <w:r>
+        <w:rPr>
+          <w:rFonts w:cs="Times New Roman"/>
+          <w:color w:val="000000"/>
+        </w:rPr>
+        <w:lastRenderedPageBreak/>
+        <w:t>Android Biometric unlock, while supporting 3-second post-payment quick tagging and peer bill splitting ('bill_splits' table).</w:t>
       </w:r>
     </w:p>
     <w:p>
       <w:pPr>
         <w:keepNext/>
         <w:spacing w:before="120" w:after="60"/>
+        <w:rPr>
+          <w:b/>
+          <w:bCs/>
+        </w:rPr>
       </w:pPr>
       <w:r>
         <w:rPr>
           <w:rFonts w:cs="Times New Roman"/>
           <w:b/>
+          <w:bCs/>
           <w:i/>
           <w:color w:val="000000"/>
         </w:rPr>
@@ -2074,7 +2077,7 @@
     </w:p>
     <w:p>
       <w:pPr>
-        <w:spacing w:after="90"/>
+        <w:spacing w:after="76"/>
         <w:jc w:val="both"/>
       </w:pPr>
       <w:r>
@@ -2082,13 +2085,13 @@
           <w:rFonts w:cs="Times New Roman"/>
           <w:color w:val="000000"/>
         </w:rPr>
-        <w:t>The scope of this project encompasses an Android-first mobile application (accounting for &gt;95% of the Indian smartphone ecosystem) and a cross-platform Flet desktop simulation shell ('435x860' viewport) for automated contract verification. The system does not process raw banking credentials, does not require NPCI PSP banking licenses (as it delegates actual fund transfer to installed PSP apps like GPay, PhonePe, Paytm, and BHIM via standard OS deep links), and excludes iOS deployment due to Apple's sandboxed URL scheme restrictions.</w:t>
+        <w:t>The scope of this project encompasses an Android-first mobile application (accounting for &gt;95% of the Indian smartphone ecosystem) and a cross-platform Flet desktop simulation shell for automated verification. The system does not process raw banking credentials, does not require NPCI banking licenses (as it delegates actual fund transfer to installed PSP apps like GPay, PhonePe, Paytm, and BHIM via standard OS deep links), and excludes iOS deployment due to Apple's sandboxed URL scheme restrictions.</w:t>
       </w:r>
     </w:p>
     <w:p>
       <w:pPr>
         <w:keepNext/>
-        <w:spacing w:before="200"/>
+        <w:spacing w:before="160"/>
       </w:pPr>
       <w:r>
         <w:rPr>
@@ -2102,7 +2105,7 @@
     </w:p>
     <w:p>
       <w:pPr>
-        <w:spacing w:after="90"/>
+        <w:spacing w:after="76"/>
         <w:jc w:val="both"/>
       </w:pPr>
       <w:r>
@@ -2110,18 +2113,23 @@
           <w:rFonts w:cs="Times New Roman"/>
           <w:color w:val="000000"/>
         </w:rPr>
-        <w:t>A comprehensive feasibility study was conducted during Sprint 0 to evaluate the technical, operational, economic, and schedule viability of the proposed v1.1 architecture prior to full-scale implementation.</w:t>
+        <w:t>A comprehensive feasibility study was conducted across technical, operational, economic, and security dimensions to validate the viability of the proposed system architecture prior to implementation.</w:t>
       </w:r>
     </w:p>
     <w:p>
       <w:pPr>
         <w:keepNext/>
         <w:spacing w:before="120" w:after="60"/>
+        <w:rPr>
+          <w:b/>
+          <w:bCs/>
+        </w:rPr>
       </w:pPr>
       <w:r>
         <w:rPr>
           <w:rFonts w:cs="Times New Roman"/>
           <w:b/>
+          <w:bCs/>
           <w:i/>
           <w:color w:val="000000"/>
         </w:rPr>
@@ -2130,7 +2138,7 @@
     </w:p>
     <w:p>
       <w:pPr>
-        <w:spacing w:after="90"/>
+        <w:spacing w:after="76"/>
         <w:jc w:val="both"/>
       </w:pPr>
       <w:r>
@@ -2138,27 +2146,32 @@
           <w:rFonts w:cs="Times New Roman"/>
           <w:color w:val="000000"/>
         </w:rPr>
-        <w:t>The project is 100% technically feasible using open-source, production-proven Python and Android bridge technologies. Flet (built on Flutter) renders native 60 FPS Material dark-mode interfaces from pure Python without requiring separate Java/Kotlin UI codebases. Python's built-in 'sqlite3', 're', and 'statistics' modules execute complex aggregation queries and Z-Score calculations in under 1 millisecond on standard ARMv8 mobile processors. Our Sprint 0 prototype has already validated the 6-table SQLite v1.1 schema, smart auto-discovery contract bridge ('src/contracts.py'), signed UPI 2.0 query preservation ('src/backend/upi_bridge.py'), and Flet 1.0+ dark-mode analytics view ('src/ui/dashboard_view.py').</w:t>
+        <w:t>The project is technically feasible using open-source, production-proven Python and Android bridge technologies. Flet (built on the Flutter rendering engine) constructs native 60 FPS Material dark-mode mobile interfaces directly from Python without requiring separate Java/Kotlin UI codebases. Python's standard 'sqlite3', 're', and 'statistics' libraries execute complex multi-table aggregation queries and Z-Score variance calculations in under 1 millisecond on standard ARMv8 mobile processors, while PyJNIus provides direct access to Android OS 'Intent' and 'Activity' lifecycle APIs.</w:t>
       </w:r>
     </w:p>
     <w:p>
       <w:pPr>
         <w:keepNext/>
         <w:spacing w:before="120" w:after="60"/>
+        <w:rPr>
+          <w:b/>
+          <w:bCs/>
+        </w:rPr>
       </w:pPr>
       <w:r>
         <w:rPr>
           <w:rFonts w:cs="Times New Roman"/>
           <w:b/>
+          <w:bCs/>
           <w:i/>
           <w:color w:val="000000"/>
         </w:rPr>
-        <w:t>4.2 Operational &amp; Economic Feasibility</w:t>
+        <w:t>4.2 Operational Feasibility</w:t>
       </w:r>
     </w:p>
     <w:p>
       <w:pPr>
-        <w:spacing w:after="90"/>
+        <w:spacing w:after="76"/>
         <w:jc w:val="both"/>
       </w:pPr>
       <w:r>
@@ -2166,27 +2179,32 @@
           <w:rFonts w:cs="Times New Roman"/>
           <w:color w:val="000000"/>
         </w:rPr>
-        <w:t>Operationally, the application introduces zero cognitive friction: users scan any merchant QR code, enter the amount, and pay via their trusted UPI app. Even when a P2P callback is stripped by the external gateway, the 1-Tap Resume Popup requires only a single tap ('Yes, Confirm Paid' or 'Failed / Cancel') upon returning to the app. Economically, the project incurs Rs. 0 in cloud hosting, API subscriptions, or commercial software licenses because all computation, storage, and CSV reporting execute 100% offline on the user's device.</w:t>
+        <w:t>Operationally, the application integrates seamlessly into a user's existing daily UPI payment habit with zero cognitive friction. Users scan any merchant QR code, enter the amount, preview real-time category and anomaly indicators, and complete the payment in their trusted UPI app. Even when an external payment gateway strips the return callback on a P2P transfer, the 1-Tap Resume Verification Popup requires only a single tap ('Yes, Confirm Paid' or 'Failed / Cancel') upon returning to the app.</w:t>
       </w:r>
     </w:p>
     <w:p>
       <w:pPr>
         <w:keepNext/>
         <w:spacing w:before="120" w:after="60"/>
+        <w:rPr>
+          <w:b/>
+          <w:bCs/>
+        </w:rPr>
       </w:pPr>
       <w:r>
         <w:rPr>
           <w:rFonts w:cs="Times New Roman"/>
           <w:b/>
+          <w:bCs/>
           <w:i/>
           <w:color w:val="000000"/>
         </w:rPr>
-        <w:t>4.3 Schedule Feasibility (4-Sprint Agile Scrum-Kanban Roadmap)</w:t>
+        <w:t>4.3 Economic and Resource Feasibility</w:t>
       </w:r>
     </w:p>
     <w:p>
       <w:pPr>
-        <w:spacing w:after="90"/>
+        <w:spacing w:after="76"/>
         <w:jc w:val="both"/>
       </w:pPr>
       <w:r>
@@ -2194,7 +2212,7 @@
           <w:rFonts w:cs="Times New Roman"/>
           <w:color w:val="000000"/>
         </w:rPr>
-        <w:t>To eliminate integration bottlenecks and Git merge conflicts, the project follows a 4-Sprint Agile Scrum-Kanban schedule from October 18 to December 15, 2026, with strict directory ownership across the four team members:</w:t>
+        <w:t>The system is 100% economically feasible with zero recurring operational cost. Because all database storage, NLP regex matching, statistical Z-Score detection, and CSV report generation execute locally on the user's smartphone without cloud servers or paid third-party APIs, the project incurs Rs. 0 in cloud hosting, database licensing, or external API fees.</w:t>
       </w:r>
     </w:p>
     <w:tbl>
@@ -2205,9 +2223,9 @@
         <w:tblLook w:val="04A0" w:firstRow="1" w:lastRow="0" w:firstColumn="1" w:lastColumn="0" w:noHBand="0" w:noVBand="1"/>
       </w:tblPr>
       <w:tblGrid>
-        <w:gridCol w:w="1700"/>
-        <w:gridCol w:w="2154"/>
-        <w:gridCol w:w="4705"/>
+        <w:gridCol w:w="1927"/>
+        <w:gridCol w:w="3174"/>
+        <w:gridCol w:w="3458"/>
       </w:tblGrid>
       <w:tr>
         <w:trPr>
@@ -2216,7 +2234,7 @@
         </w:trPr>
         <w:tc>
           <w:tcPr>
-            <w:tcW w:w="1700" w:type="dxa"/>
+            <w:tcW w:w="1927" w:type="dxa"/>
             <w:tcBorders>
               <w:top w:val="single" w:sz="6" w:space="0" w:color="000000"/>
               <w:left w:val="single" w:sz="6" w:space="0" w:color="000000"/>
@@ -2225,10 +2243,10 @@
             </w:tcBorders>
             <w:shd w:val="clear" w:color="auto" w:fill="EFEFEF"/>
             <w:tcMar>
-              <w:top w:w="60" w:type="dxa"/>
-              <w:left w:w="85" w:type="dxa"/>
-              <w:bottom w:w="60" w:type="dxa"/>
-              <w:right w:w="85" w:type="dxa"/>
+              <w:top w:w="42" w:type="dxa"/>
+              <w:left w:w="80" w:type="dxa"/>
+              <w:bottom w:w="42" w:type="dxa"/>
+              <w:right w:w="80" w:type="dxa"/>
             </w:tcMar>
           </w:tcPr>
           <w:p>
@@ -2241,15 +2259,14 @@
                 <w:rFonts w:cs="Times New Roman"/>
                 <w:b/>
                 <w:color w:val="000000"/>
-                <w:sz w:val="22"/>
               </w:rPr>
-              <w:t>Sprint Phase</w:t>
+              <w:t>Feasibility Dimension</w:t>
             </w:r>
           </w:p>
         </w:tc>
         <w:tc>
           <w:tcPr>
-            <w:tcW w:w="2154" w:type="dxa"/>
+            <w:tcW w:w="3174" w:type="dxa"/>
             <w:tcBorders>
               <w:top w:val="single" w:sz="6" w:space="0" w:color="000000"/>
               <w:left w:val="single" w:sz="6" w:space="0" w:color="000000"/>
@@ -2258,10 +2275,10 @@
             </w:tcBorders>
             <w:shd w:val="clear" w:color="auto" w:fill="EFEFEF"/>
             <w:tcMar>
-              <w:top w:w="60" w:type="dxa"/>
-              <w:left w:w="85" w:type="dxa"/>
-              <w:bottom w:w="60" w:type="dxa"/>
-              <w:right w:w="85" w:type="dxa"/>
+              <w:top w:w="42" w:type="dxa"/>
+              <w:left w:w="80" w:type="dxa"/>
+              <w:bottom w:w="42" w:type="dxa"/>
+              <w:right w:w="80" w:type="dxa"/>
             </w:tcMar>
           </w:tcPr>
           <w:p>
@@ -2274,15 +2291,14 @@
                 <w:rFonts w:cs="Times New Roman"/>
                 <w:b/>
                 <w:color w:val="000000"/>
-                <w:sz w:val="22"/>
               </w:rPr>
-              <w:t>Milestone &amp; Release Tag</w:t>
+              <w:t>Architectural Mechanism</w:t>
             </w:r>
           </w:p>
         </w:tc>
         <w:tc>
           <w:tcPr>
-            <w:tcW w:w="4705" w:type="dxa"/>
+            <w:tcW w:w="3458" w:type="dxa"/>
             <w:tcBorders>
               <w:top w:val="single" w:sz="6" w:space="0" w:color="000000"/>
               <w:left w:val="single" w:sz="6" w:space="0" w:color="000000"/>
@@ -2291,10 +2307,10 @@
             </w:tcBorders>
             <w:shd w:val="clear" w:color="auto" w:fill="EFEFEF"/>
             <w:tcMar>
-              <w:top w:w="60" w:type="dxa"/>
-              <w:left w:w="85" w:type="dxa"/>
-              <w:bottom w:w="60" w:type="dxa"/>
-              <w:right w:w="85" w:type="dxa"/>
+              <w:top w:w="42" w:type="dxa"/>
+              <w:left w:w="80" w:type="dxa"/>
+              <w:bottom w:w="42" w:type="dxa"/>
+              <w:right w:w="80" w:type="dxa"/>
             </w:tcMar>
           </w:tcPr>
           <w:p>
@@ -2307,9 +2323,8 @@
                 <w:rFonts w:cs="Times New Roman"/>
                 <w:b/>
                 <w:color w:val="000000"/>
-                <w:sz w:val="22"/>
               </w:rPr>
-              <w:t>Key Engineering Deliverables</w:t>
+              <w:t>Assessment &amp; Validation Outcome</w:t>
             </w:r>
           </w:p>
         </w:tc>
@@ -2321,7 +2336,7 @@
         </w:trPr>
         <w:tc>
           <w:tcPr>
-            <w:tcW w:w="1700" w:type="dxa"/>
+            <w:tcW w:w="1927" w:type="dxa"/>
             <w:tcBorders>
               <w:top w:val="single" w:sz="4" w:space="0" w:color="000000"/>
               <w:left w:val="single" w:sz="4" w:space="0" w:color="000000"/>
@@ -2329,10 +2344,10 @@
               <w:right w:val="single" w:sz="4" w:space="0" w:color="000000"/>
             </w:tcBorders>
             <w:tcMar>
-              <w:top w:w="55" w:type="dxa"/>
-              <w:left w:w="85" w:type="dxa"/>
-              <w:bottom w:w="55" w:type="dxa"/>
-              <w:right w:w="85" w:type="dxa"/>
+              <w:top w:w="38" w:type="dxa"/>
+              <w:left w:w="80" w:type="dxa"/>
+              <w:bottom w:w="38" w:type="dxa"/>
+              <w:right w:w="80" w:type="dxa"/>
             </w:tcMar>
           </w:tcPr>
           <w:p>
@@ -2344,25 +2359,14 @@
                 <w:rFonts w:cs="Times New Roman"/>
                 <w:b/>
                 <w:color w:val="000000"/>
-                <w:sz w:val="22"/>
               </w:rPr>
-              <w:t>Sprint 0</w:t>
-            </w:r>
-            <w:r>
-              <w:rPr>
-                <w:rFonts w:cs="Times New Roman"/>
-                <w:b/>
-                <w:color w:val="000000"/>
-                <w:sz w:val="22"/>
-              </w:rPr>
-              <w:br/>
-              <w:t>(Oct 18–Oct 30)</w:t>
+              <w:t>Technical Dimension</w:t>
             </w:r>
           </w:p>
         </w:tc>
         <w:tc>
           <w:tcPr>
-            <w:tcW w:w="2154" w:type="dxa"/>
+            <w:tcW w:w="3174" w:type="dxa"/>
             <w:tcBorders>
               <w:top w:val="single" w:sz="4" w:space="0" w:color="000000"/>
               <w:left w:val="single" w:sz="4" w:space="0" w:color="000000"/>
@@ -2370,10 +2374,10 @@
               <w:right w:val="single" w:sz="4" w:space="0" w:color="000000"/>
             </w:tcBorders>
             <w:tcMar>
-              <w:top w:w="55" w:type="dxa"/>
-              <w:left w:w="85" w:type="dxa"/>
-              <w:bottom w:w="55" w:type="dxa"/>
-              <w:right w:w="85" w:type="dxa"/>
+              <w:top w:w="38" w:type="dxa"/>
+              <w:left w:w="80" w:type="dxa"/>
+              <w:bottom w:w="38" w:type="dxa"/>
+              <w:right w:w="80" w:type="dxa"/>
             </w:tcMar>
           </w:tcPr>
           <w:p>
@@ -2384,15 +2388,14 @@
               <w:rPr>
                 <w:rFonts w:cs="Times New Roman"/>
                 <w:color w:val="000000"/>
-                <w:sz w:val="22"/>
               </w:rPr>
-              <w:t>Synopsis &amp; Core Foundation</w:t>
+              <w:t>Python 3.11+, Flet UI framework, SQLite3 / SQLCipher, and PyJNIus Android OS bridge.</w:t>
             </w:r>
           </w:p>
         </w:tc>
         <w:tc>
           <w:tcPr>
-            <w:tcW w:w="4705" w:type="dxa"/>
+            <w:tcW w:w="3458" w:type="dxa"/>
             <w:tcBorders>
               <w:top w:val="single" w:sz="4" w:space="0" w:color="000000"/>
               <w:left w:val="single" w:sz="4" w:space="0" w:color="000000"/>
@@ -2400,10 +2403,10 @@
               <w:right w:val="single" w:sz="4" w:space="0" w:color="000000"/>
             </w:tcBorders>
             <w:tcMar>
-              <w:top w:w="55" w:type="dxa"/>
-              <w:left w:w="85" w:type="dxa"/>
-              <w:bottom w:w="55" w:type="dxa"/>
-              <w:right w:w="85" w:type="dxa"/>
+              <w:top w:w="38" w:type="dxa"/>
+              <w:left w:w="80" w:type="dxa"/>
+              <w:bottom w:w="38" w:type="dxa"/>
+              <w:right w:w="80" w:type="dxa"/>
             </w:tcMar>
           </w:tcPr>
           <w:p>
@@ -2414,9 +2417,8 @@
               <w:rPr>
                 <w:rFonts w:cs="Times New Roman"/>
                 <w:color w:val="000000"/>
-                <w:sz w:val="22"/>
               </w:rPr>
-              <w:t>Freeze v1.1 specs, lock src/contracts.py &amp; 40-txn SQLite seeder (seed_mock_data.py), verify signed UPI URI builder (S0-03), Flet shell (S0-04), Regex prototype (S0-05), &amp; Synopsis submission (S0-06).</w:t>
+              <w:t>Feasible — Achieves &lt;1 ms analytics latency and &lt;500 ms warm resume within a 25–35 MB APK.</w:t>
             </w:r>
           </w:p>
         </w:tc>
@@ -2428,7 +2430,7 @@
         </w:trPr>
         <w:tc>
           <w:tcPr>
-            <w:tcW w:w="1700" w:type="dxa"/>
+            <w:tcW w:w="1927" w:type="dxa"/>
             <w:tcBorders>
               <w:top w:val="single" w:sz="4" w:space="0" w:color="000000"/>
               <w:left w:val="single" w:sz="4" w:space="0" w:color="000000"/>
@@ -2436,10 +2438,10 @@
               <w:right w:val="single" w:sz="4" w:space="0" w:color="000000"/>
             </w:tcBorders>
             <w:tcMar>
-              <w:top w:w="55" w:type="dxa"/>
-              <w:left w:w="85" w:type="dxa"/>
-              <w:bottom w:w="55" w:type="dxa"/>
-              <w:right w:w="85" w:type="dxa"/>
+              <w:top w:w="38" w:type="dxa"/>
+              <w:left w:w="80" w:type="dxa"/>
+              <w:bottom w:w="38" w:type="dxa"/>
+              <w:right w:w="80" w:type="dxa"/>
             </w:tcMar>
           </w:tcPr>
           <w:p>
@@ -2451,26 +2453,15 @@
                 <w:rFonts w:cs="Times New Roman"/>
                 <w:b/>
                 <w:color w:val="000000"/>
-                <w:sz w:val="22"/>
               </w:rPr>
               <w:lastRenderedPageBreak/>
-              <w:t>Sprint 1</w:t>
-            </w:r>
-            <w:r>
-              <w:rPr>
-                <w:rFonts w:cs="Times New Roman"/>
-                <w:b/>
-                <w:color w:val="000000"/>
-                <w:sz w:val="22"/>
-              </w:rPr>
-              <w:br/>
-              <w:t>(Oct 31–Nov 10)</w:t>
+              <w:t>Operational Dimension</w:t>
             </w:r>
           </w:p>
         </w:tc>
         <w:tc>
           <w:tcPr>
-            <w:tcW w:w="2154" w:type="dxa"/>
+            <w:tcW w:w="3174" w:type="dxa"/>
             <w:tcBorders>
               <w:top w:val="single" w:sz="4" w:space="0" w:color="000000"/>
               <w:left w:val="single" w:sz="4" w:space="0" w:color="000000"/>
@@ -2478,10 +2469,10 @@
               <w:right w:val="single" w:sz="4" w:space="0" w:color="000000"/>
             </w:tcBorders>
             <w:tcMar>
-              <w:top w:w="55" w:type="dxa"/>
-              <w:left w:w="85" w:type="dxa"/>
-              <w:bottom w:w="55" w:type="dxa"/>
-              <w:right w:w="85" w:type="dxa"/>
+              <w:top w:w="38" w:type="dxa"/>
+              <w:left w:w="80" w:type="dxa"/>
+              <w:bottom w:w="38" w:type="dxa"/>
+              <w:right w:w="80" w:type="dxa"/>
             </w:tcMar>
           </w:tcPr>
           <w:p>
@@ -2492,15 +2483,14 @@
               <w:rPr>
                 <w:rFonts w:cs="Times New Roman"/>
                 <w:color w:val="000000"/>
-                <w:sz w:val="22"/>
               </w:rPr>
-              <w:t>Core Skeleton &amp; Fallback MVP (v0.1-alpha)</w:t>
+              <w:t>Hybrid Intent Callback + 1-Tap Resume Verification Popup with 1-Tap Merchant Tagging.</w:t>
             </w:r>
           </w:p>
         </w:tc>
         <w:tc>
           <w:tcPr>
-            <w:tcW w:w="4705" w:type="dxa"/>
+            <w:tcW w:w="3458" w:type="dxa"/>
             <w:tcBorders>
               <w:top w:val="single" w:sz="4" w:space="0" w:color="000000"/>
               <w:left w:val="single" w:sz="4" w:space="0" w:color="000000"/>
@@ -2508,10 +2498,10 @@
               <w:right w:val="single" w:sz="4" w:space="0" w:color="000000"/>
             </w:tcBorders>
             <w:tcMar>
-              <w:top w:w="55" w:type="dxa"/>
-              <w:left w:w="85" w:type="dxa"/>
-              <w:bottom w:w="55" w:type="dxa"/>
-              <w:right w:w="85" w:type="dxa"/>
+              <w:top w:w="38" w:type="dxa"/>
+              <w:left w:w="80" w:type="dxa"/>
+              <w:bottom w:w="38" w:type="dxa"/>
+              <w:right w:w="80" w:type="dxa"/>
             </w:tcMar>
           </w:tcPr>
           <w:p>
@@ -2522,9 +2512,8 @@
               <w:rPr>
                 <w:rFonts w:cs="Times New Roman"/>
                 <w:color w:val="000000"/>
-                <w:sz w:val="22"/>
               </w:rPr>
-              <w:t>Implement full 6-table SQLite v1.1 CRUD (src/db/database.py), pending_transactions state preserver, Home &amp; Scan/Pay Flet screens, and 1-Tap Resume Verification Popup.</w:t>
+              <w:t>Feasible — Guarantees 100% transaction logging even during OS background kills or stripped callbacks.</w:t>
             </w:r>
           </w:p>
         </w:tc>
@@ -2536,7 +2525,7 @@
         </w:trPr>
         <w:tc>
           <w:tcPr>
-            <w:tcW w:w="1700" w:type="dxa"/>
+            <w:tcW w:w="1927" w:type="dxa"/>
             <w:tcBorders>
               <w:top w:val="single" w:sz="4" w:space="0" w:color="000000"/>
               <w:left w:val="single" w:sz="4" w:space="0" w:color="000000"/>
@@ -2544,10 +2533,10 @@
               <w:right w:val="single" w:sz="4" w:space="0" w:color="000000"/>
             </w:tcBorders>
             <w:tcMar>
-              <w:top w:w="55" w:type="dxa"/>
-              <w:left w:w="85" w:type="dxa"/>
-              <w:bottom w:w="55" w:type="dxa"/>
-              <w:right w:w="85" w:type="dxa"/>
+              <w:top w:w="38" w:type="dxa"/>
+              <w:left w:w="80" w:type="dxa"/>
+              <w:bottom w:w="38" w:type="dxa"/>
+              <w:right w:w="80" w:type="dxa"/>
             </w:tcMar>
           </w:tcPr>
           <w:p>
@@ -2559,25 +2548,14 @@
                 <w:rFonts w:cs="Times New Roman"/>
                 <w:b/>
                 <w:color w:val="000000"/>
-                <w:sz w:val="22"/>
               </w:rPr>
-              <w:t>Sprint 2</w:t>
-            </w:r>
-            <w:r>
-              <w:rPr>
-                <w:rFonts w:cs="Times New Roman"/>
-                <w:b/>
-                <w:color w:val="000000"/>
-                <w:sz w:val="22"/>
-              </w:rPr>
-              <w:br/>
-              <w:t>(Nov 11–Nov 22)</w:t>
+              <w:t>Economic Dimension</w:t>
             </w:r>
           </w:p>
         </w:tc>
         <w:tc>
           <w:tcPr>
-            <w:tcW w:w="2154" w:type="dxa"/>
+            <w:tcW w:w="3174" w:type="dxa"/>
             <w:tcBorders>
               <w:top w:val="single" w:sz="4" w:space="0" w:color="000000"/>
               <w:left w:val="single" w:sz="4" w:space="0" w:color="000000"/>
@@ -2585,10 +2563,10 @@
               <w:right w:val="single" w:sz="4" w:space="0" w:color="000000"/>
             </w:tcBorders>
             <w:tcMar>
-              <w:top w:w="55" w:type="dxa"/>
-              <w:left w:w="85" w:type="dxa"/>
-              <w:bottom w:w="55" w:type="dxa"/>
-              <w:right w:w="85" w:type="dxa"/>
+              <w:top w:w="38" w:type="dxa"/>
+              <w:left w:w="80" w:type="dxa"/>
+              <w:bottom w:w="38" w:type="dxa"/>
+              <w:right w:w="80" w:type="dxa"/>
             </w:tcMar>
           </w:tcPr>
           <w:p>
@@ -2599,15 +2577,14 @@
               <w:rPr>
                 <w:rFonts w:cs="Times New Roman"/>
                 <w:color w:val="000000"/>
-                <w:sz w:val="22"/>
               </w:rPr>
-              <w:t>Pure-Python Analytics Engine (v0.2-beta)</w:t>
+              <w:t>100% offline edge-computing architecture using open-source libraries and local storage.</w:t>
             </w:r>
           </w:p>
         </w:tc>
         <w:tc>
           <w:tcPr>
-            <w:tcW w:w="4705" w:type="dxa"/>
+            <w:tcW w:w="3458" w:type="dxa"/>
             <w:tcBorders>
               <w:top w:val="single" w:sz="4" w:space="0" w:color="000000"/>
               <w:left w:val="single" w:sz="4" w:space="0" w:color="000000"/>
@@ -2615,10 +2592,10 @@
               <w:right w:val="single" w:sz="4" w:space="0" w:color="000000"/>
             </w:tcBorders>
             <w:tcMar>
-              <w:top w:w="55" w:type="dxa"/>
-              <w:left w:w="85" w:type="dxa"/>
-              <w:bottom w:w="55" w:type="dxa"/>
-              <w:right w:w="85" w:type="dxa"/>
+              <w:top w:w="38" w:type="dxa"/>
+              <w:left w:w="80" w:type="dxa"/>
+              <w:bottom w:w="38" w:type="dxa"/>
+              <w:right w:w="80" w:type="dxa"/>
             </w:tcMar>
           </w:tcPr>
           <w:p>
@@ -2629,9 +2606,8 @@
               <w:rPr>
                 <w:rFonts w:cs="Times New Roman"/>
                 <w:color w:val="000000"/>
-                <w:sz w:val="22"/>
               </w:rPr>
-              <w:t>Build 3-Tier Categorization Engine (tagger.py), Crash-Proof Z-Score Anomaly Detector (anomaly.py), Clamped 0-100 Health Score (health_score.py), and First-Time Tag UI.</w:t>
+              <w:t>Feasible — Zero cloud server costs, zero paid API dependencies, and zero subscription fees.</w:t>
             </w:r>
           </w:p>
         </w:tc>
@@ -2643,7 +2619,7 @@
         </w:trPr>
         <w:tc>
           <w:tcPr>
-            <w:tcW w:w="1700" w:type="dxa"/>
+            <w:tcW w:w="1927" w:type="dxa"/>
             <w:tcBorders>
               <w:top w:val="single" w:sz="4" w:space="0" w:color="000000"/>
               <w:left w:val="single" w:sz="4" w:space="0" w:color="000000"/>
@@ -2651,10 +2627,10 @@
               <w:right w:val="single" w:sz="4" w:space="0" w:color="000000"/>
             </w:tcBorders>
             <w:tcMar>
-              <w:top w:w="55" w:type="dxa"/>
-              <w:left w:w="85" w:type="dxa"/>
-              <w:bottom w:w="55" w:type="dxa"/>
-              <w:right w:w="85" w:type="dxa"/>
+              <w:top w:w="38" w:type="dxa"/>
+              <w:left w:w="80" w:type="dxa"/>
+              <w:bottom w:w="38" w:type="dxa"/>
+              <w:right w:w="80" w:type="dxa"/>
             </w:tcMar>
           </w:tcPr>
           <w:p>
@@ -2666,25 +2642,14 @@
                 <w:rFonts w:cs="Times New Roman"/>
                 <w:b/>
                 <w:color w:val="000000"/>
-                <w:sz w:val="22"/>
               </w:rPr>
-              <w:t>Sprint 3</w:t>
-            </w:r>
-            <w:r>
-              <w:rPr>
-                <w:rFonts w:cs="Times New Roman"/>
-                <w:b/>
-                <w:color w:val="000000"/>
-                <w:sz w:val="22"/>
-              </w:rPr>
-              <w:br/>
-              <w:t>(Nov 23–Dec 04)</w:t>
+              <w:t>Security &amp; Legal Dimension</w:t>
             </w:r>
           </w:p>
         </w:tc>
         <w:tc>
           <w:tcPr>
-            <w:tcW w:w="2154" w:type="dxa"/>
+            <w:tcW w:w="3174" w:type="dxa"/>
             <w:tcBorders>
               <w:top w:val="single" w:sz="4" w:space="0" w:color="000000"/>
               <w:left w:val="single" w:sz="4" w:space="0" w:color="000000"/>
@@ -2692,10 +2657,10 @@
               <w:right w:val="single" w:sz="4" w:space="0" w:color="000000"/>
             </w:tcBorders>
             <w:tcMar>
-              <w:top w:w="55" w:type="dxa"/>
-              <w:left w:w="85" w:type="dxa"/>
-              <w:bottom w:w="55" w:type="dxa"/>
-              <w:right w:w="85" w:type="dxa"/>
+              <w:top w:w="38" w:type="dxa"/>
+              <w:left w:w="80" w:type="dxa"/>
+              <w:bottom w:w="38" w:type="dxa"/>
+              <w:right w:w="80" w:type="dxa"/>
             </w:tcMar>
           </w:tcPr>
           <w:p>
@@ -2706,15 +2671,14 @@
               <w:rPr>
                 <w:rFonts w:cs="Times New Roman"/>
                 <w:color w:val="000000"/>
-                <w:sz w:val="22"/>
               </w:rPr>
-              <w:t>Visual Dashboard &amp; Android Bridge (v0.3-rc)</w:t>
+              <w:t>Zero-Knowledge local SQLCipher 256-bit AES encryption; delegates payment execution to NPCI PSP apps.</w:t>
             </w:r>
           </w:p>
         </w:tc>
         <w:tc>
           <w:tcPr>
-            <w:tcW w:w="4705" w:type="dxa"/>
+            <w:tcW w:w="3458" w:type="dxa"/>
             <w:tcBorders>
               <w:top w:val="single" w:sz="4" w:space="0" w:color="000000"/>
               <w:left w:val="single" w:sz="4" w:space="0" w:color="000000"/>
@@ -2722,10 +2686,10 @@
               <w:right w:val="single" w:sz="4" w:space="0" w:color="000000"/>
             </w:tcBorders>
             <w:tcMar>
-              <w:top w:w="55" w:type="dxa"/>
-              <w:left w:w="85" w:type="dxa"/>
-              <w:bottom w:w="55" w:type="dxa"/>
-              <w:right w:w="85" w:type="dxa"/>
+              <w:top w:w="38" w:type="dxa"/>
+              <w:left w:w="80" w:type="dxa"/>
+              <w:bottom w:w="38" w:type="dxa"/>
+              <w:right w:w="80" w:type="dxa"/>
             </w:tcMar>
           </w:tcPr>
           <w:p>
@@ -2736,116 +2700,8 @@
               <w:rPr>
                 <w:rFonts w:cs="Times New Roman"/>
                 <w:color w:val="000000"/>
-                <w:sz w:val="22"/>
               </w:rPr>
-              <w:t>Render native Flet PieChart &amp; BarChart, Mid-Month Pace Alerts (&gt;20% pace exceedance), offline CSV Exporter (exporter.py), and PyJNIus onActivityResult Android bridge.</w:t>
-            </w:r>
-          </w:p>
-        </w:tc>
-      </w:tr>
-      <w:tr>
-        <w:trPr>
-          <w:cantSplit/>
-          <w:jc w:val="center"/>
-        </w:trPr>
-        <w:tc>
-          <w:tcPr>
-            <w:tcW w:w="1700" w:type="dxa"/>
-            <w:tcBorders>
-              <w:top w:val="single" w:sz="4" w:space="0" w:color="000000"/>
-              <w:left w:val="single" w:sz="4" w:space="0" w:color="000000"/>
-              <w:bottom w:val="single" w:sz="4" w:space="0" w:color="000000"/>
-              <w:right w:val="single" w:sz="4" w:space="0" w:color="000000"/>
-            </w:tcBorders>
-            <w:tcMar>
-              <w:top w:w="55" w:type="dxa"/>
-              <w:left w:w="85" w:type="dxa"/>
-              <w:bottom w:w="55" w:type="dxa"/>
-              <w:right w:w="85" w:type="dxa"/>
-            </w:tcMar>
-          </w:tcPr>
-          <w:p>
-            <w:pPr>
-              <w:spacing w:before="20" w:after="20"/>
-            </w:pPr>
-            <w:r>
-              <w:rPr>
-                <w:rFonts w:cs="Times New Roman"/>
-                <w:b/>
-                <w:color w:val="000000"/>
-                <w:sz w:val="22"/>
-              </w:rPr>
-              <w:t>Sprint 4</w:t>
-            </w:r>
-            <w:r>
-              <w:rPr>
-                <w:rFonts w:cs="Times New Roman"/>
-                <w:b/>
-                <w:color w:val="000000"/>
-                <w:sz w:val="22"/>
-              </w:rPr>
-              <w:br/>
-              <w:t>(Dec 05–Dec 15)</w:t>
-            </w:r>
-          </w:p>
-        </w:tc>
-        <w:tc>
-          <w:tcPr>
-            <w:tcW w:w="2154" w:type="dxa"/>
-            <w:tcBorders>
-              <w:top w:val="single" w:sz="4" w:space="0" w:color="000000"/>
-              <w:left w:val="single" w:sz="4" w:space="0" w:color="000000"/>
-              <w:bottom w:val="single" w:sz="4" w:space="0" w:color="000000"/>
-              <w:right w:val="single" w:sz="4" w:space="0" w:color="000000"/>
-            </w:tcBorders>
-            <w:tcMar>
-              <w:top w:w="55" w:type="dxa"/>
-              <w:left w:w="85" w:type="dxa"/>
-              <w:bottom w:w="55" w:type="dxa"/>
-              <w:right w:w="85" w:type="dxa"/>
-            </w:tcMar>
-          </w:tcPr>
-          <w:p>
-            <w:pPr>
-              <w:spacing w:before="20" w:after="20"/>
-            </w:pPr>
-            <w:r>
-              <w:rPr>
-                <w:rFonts w:cs="Times New Roman"/>
-                <w:color w:val="000000"/>
-                <w:sz w:val="22"/>
-              </w:rPr>
-              <w:t>Security, Bill Split &amp; Final APK (v1.0-final)</w:t>
-            </w:r>
-          </w:p>
-        </w:tc>
-        <w:tc>
-          <w:tcPr>
-            <w:tcW w:w="4705" w:type="dxa"/>
-            <w:tcBorders>
-              <w:top w:val="single" w:sz="4" w:space="0" w:color="000000"/>
-              <w:left w:val="single" w:sz="4" w:space="0" w:color="000000"/>
-              <w:bottom w:val="single" w:sz="4" w:space="0" w:color="000000"/>
-              <w:right w:val="single" w:sz="4" w:space="0" w:color="000000"/>
-            </w:tcBorders>
-            <w:tcMar>
-              <w:top w:w="55" w:type="dxa"/>
-              <w:left w:w="85" w:type="dxa"/>
-              <w:bottom w:w="55" w:type="dxa"/>
-              <w:right w:w="85" w:type="dxa"/>
-            </w:tcMar>
-          </w:tcPr>
-          <w:p>
-            <w:pPr>
-              <w:spacing w:before="20" w:after="20"/>
-            </w:pPr>
-            <w:r>
-              <w:rPr>
-                <w:rFonts w:cs="Times New Roman"/>
-                <w:color w:val="000000"/>
-                <w:sz w:val="22"/>
-              </w:rPr>
-              <w:t>Integrate SQLCipher 256-bit AES encryption &amp; Biometric lock (security.py), 3-second Quick Tags &amp; Bill Split modal (REQ-15), 500-txn latency benchmark, and final Android APK build.</w:t>
+              <w:t>Feasible — Requires no sensitive SMS read permissions and complies with mobile privacy guidelines.</w:t>
             </w:r>
           </w:p>
         </w:tc>
@@ -2859,7 +2715,7 @@
     <w:p>
       <w:pPr>
         <w:keepNext/>
-        <w:spacing w:before="200"/>
+        <w:spacing w:before="160"/>
       </w:pPr>
       <w:r>
         <w:rPr>
@@ -2873,7 +2729,7 @@
     </w:p>
     <w:p>
       <w:pPr>
-        <w:spacing w:after="90"/>
+        <w:spacing w:after="76"/>
         <w:jc w:val="both"/>
       </w:pPr>
       <w:r>
@@ -2881,18 +2737,23 @@
           <w:rFonts w:cs="Times New Roman"/>
           <w:color w:val="000000"/>
         </w:rPr>
-        <w:t>Our engineering methodology combines Modular Contract-Driven Development ('src/contracts.py') with a layered 4-Tier System Architecture: (1) Presentation Layer in Python Flet, (2) Smart Contract &amp; Auto-Discovery Integration Layer, (3) Pure-Python Statistical Analytics Layer, and (4) Encrypted SQLite v1.1 Persistence &amp; Android OS Intent Bridge Layer.</w:t>
+        <w:t>The proposed system follows a modular, layered 4-Tier Architecture: (1) Presentation &amp; Lifecycle UI Layer in Python Flet, (2) Modular Interface &amp; Integration Layer, (3) Pure-Python Statistical Analytics Layer, and (4) Encrypted SQLite Persistence &amp; Android OS Intent Bridge Layer.</w:t>
       </w:r>
     </w:p>
     <w:p>
       <w:pPr>
         <w:keepNext/>
         <w:spacing w:before="120" w:after="60"/>
+        <w:rPr>
+          <w:b/>
+          <w:bCs/>
+        </w:rPr>
       </w:pPr>
       <w:r>
         <w:rPr>
           <w:rFonts w:cs="Times New Roman"/>
           <w:b/>
+          <w:bCs/>
           <w:i/>
           <w:color w:val="000000"/>
         </w:rPr>
@@ -2901,7 +2762,7 @@
     </w:p>
     <w:p>
       <w:pPr>
-        <w:spacing w:after="90"/>
+        <w:spacing w:after="76"/>
         <w:jc w:val="both"/>
       </w:pPr>
       <w:r>
@@ -2909,12 +2770,12 @@
           <w:rFonts w:cs="Times New Roman"/>
           <w:color w:val="000000"/>
         </w:rPr>
-        <w:t>When a user scans a merchant QR code or selects a payee VPA, the system executes a deterministic 5-stage transaction workflow:</w:t>
+        <w:t>When a user scans a merchant QR code or enters a payee VPA, the application executes a deterministic 5-stage transaction workflow:</w:t>
       </w:r>
     </w:p>
     <w:p>
       <w:pPr>
-        <w:spacing w:after="60"/>
+        <w:spacing w:after="44"/>
         <w:ind w:left="397" w:hanging="227"/>
         <w:jc w:val="both"/>
       </w:pPr>
@@ -2931,12 +2792,12 @@
           <w:rFonts w:cs="Times New Roman"/>
           <w:color w:val="000000"/>
         </w:rPr>
-        <w:t>The scanned URI is passed to 'build_signed_upi_uri(raw_qr_uri, amount)'. Using 'urllib.parse.urlsplit' and 'parse_qsl', the parser retains all existing NPCI UPI 2.0 merchant fields ('pa', 'pn', 'mc', 'tid', 'tr', 'tn', 'sign', 'orgid', 'mode') and updates only 'am' (formatted to ':.2f') and 'cu=INR' using 'urlencode(params, safe="@/:")'.</w:t>
+        <w:t>The scanned URI is parsed using 'urllib.parse.urlsplit' and 'parse_qsl'. The URI builder retains all existing NPCI UPI 2.0 merchant fields ('pa', 'pn', 'mc', 'tid', 'tr', 'tn', 'sign', 'orgid', 'mode') and updates only 'am' (formatted to 2 decimal places) and 'cu=INR' using 'urlencode(params, safe="@/:")'.</w:t>
       </w:r>
     </w:p>
     <w:p>
       <w:pPr>
-        <w:spacing w:after="60"/>
+        <w:spacing w:after="44"/>
         <w:ind w:left="397" w:hanging="227"/>
         <w:jc w:val="both"/>
       </w:pPr>
@@ -2953,12 +2814,12 @@
           <w:rFonts w:cs="Times New Roman"/>
           <w:color w:val="000000"/>
         </w:rPr>
-        <w:t>Before invoking the external UPI app, 'create_pending_txn()' writes a record with 'status = PENDING' into the 'pending_transactions' table, storing 'amount', 'payee_vpa', 'payee_name', 'raw_qr_uri', and 'init_time', and returns the auto-incremented primary key 'internal_id'.</w:t>
+        <w:t>Before invoking the external UPI app, the backend writes a record with 'status = PENDING' into the 'pending_transactions' table, storing 'amount', 'payee_vpa', 'payee_name', 'raw_qr_uri', and 'init_time', and returns the auto-incremented primary key 'internal_id'.</w:t>
       </w:r>
     </w:p>
     <w:p>
       <w:pPr>
-        <w:spacing w:after="60"/>
+        <w:spacing w:after="44"/>
         <w:ind w:left="397" w:hanging="227"/>
         <w:jc w:val="both"/>
       </w:pPr>
@@ -2975,12 +2836,34 @@
           <w:rFonts w:cs="Times New Roman"/>
           <w:color w:val="000000"/>
         </w:rPr>
-        <w:t>On Android, PyJNIus dispatches an 'ACTION_VIEW' intent with the signed URI to the selected UPI app (GPay, PhonePe, Paytm, or BHIM). If the target app returns a valid 'Status=SUCCESS' payload via 'onActivityResult', the row is automatically resolved.</w:t>
+        <w:t>On Android, PyJNIus dispatches an 'ACTION_VIEW' intent with the signed URI to the selected UPI app (GPay, PhonePe, Paytm, or BHIM). If the target app returns a valid 'Status=SUCCESS' payload via 'onActivityResult', the pending record is automatically resolved.</w:t>
       </w:r>
     </w:p>
     <w:p>
       <w:pPr>
-        <w:spacing w:after="60"/>
+        <w:spacing w:after="44"/>
+        <w:ind w:left="397" w:hanging="227"/>
+        <w:jc w:val="both"/>
+      </w:pPr>
+      <w:r>
+        <w:rPr>
+          <w:rFonts w:cs="Times New Roman"/>
+          <w:b/>
+          <w:color w:val="000000"/>
+        </w:rPr>
+        <w:t xml:space="preserve">• Stage 4 (1-Tap Resume Fallback Verification): </w:t>
+      </w:r>
+      <w:r>
+        <w:rPr>
+          <w:rFonts w:cs="Times New Roman"/>
+          <w:color w:val="000000"/>
+        </w:rPr>
+        <w:t>If the Android OS terminated the background process or the UPI app returned 'RESULT_CANCELED' / stripped the callback, the application lifecycle listener detects 'RESUME' on reopening, queries unresolved pending records, and presents a 1-Tap Verification Banner asking whether payment '#internal_id' succeeded.</w:t>
+      </w:r>
+    </w:p>
+    <w:p>
+      <w:pPr>
+        <w:spacing w:after="44"/>
         <w:ind w:left="397" w:hanging="227"/>
         <w:jc w:val="both"/>
       </w:pPr>
@@ -2991,28 +2874,6 @@
           <w:color w:val="000000"/>
         </w:rPr>
         <w:lastRenderedPageBreak/>
-        <w:t xml:space="preserve">• Stage 4 (1-Tap Resume Fallback Verification): </w:t>
-      </w:r>
-      <w:r>
-        <w:rPr>
-          <w:rFonts w:cs="Times New Roman"/>
-          <w:color w:val="000000"/>
-        </w:rPr>
-        <w:t>If the Android OS killed the background process or the UPI app returned 'RESULT_CANCELED' / stripped the callback, Flet's lifecycle listener detects 'RESUME' on app reopening, queries 'get_unresolved_pending()', and presents a 1-Tap Verification Banner asking whether payment '#internal_id' succeeded.</w:t>
-      </w:r>
-    </w:p>
-    <w:p>
-      <w:pPr>
-        <w:spacing w:after="60"/>
-        <w:ind w:left="397" w:hanging="227"/>
-        <w:jc w:val="both"/>
-      </w:pPr>
-      <w:r>
-        <w:rPr>
-          <w:rFonts w:cs="Times New Roman"/>
-          <w:b/>
-          <w:color w:val="000000"/>
-        </w:rPr>
         <w:t xml:space="preserve">• Stage 5 (Analytics Enrichment &amp; Ledger Commit): </w:t>
       </w:r>
       <w:r>
@@ -3020,27 +2881,32 @@
           <w:rFonts w:cs="Times New Roman"/>
           <w:color w:val="000000"/>
         </w:rPr>
-        <w:t>Upon confirmation, 'resolve_pending_txn(internal_id, status="RESOLVED")' updates the specific pending row strictly via 'WHERE internal_id = ?', executes the 3-Tier Tagger and Safe Z-Score Anomaly Detector, and inserts the verified record into the 'transactions' table.</w:t>
+        <w:t>Upon confirmation, the resolution pipeline updates the specific pending row strictly via 'WHERE internal_id = ?', executes the 3-Tier Categorization Engine and Safe Z-Score Anomaly Detector, and inserts the verified record into the master 'transactions' table.</w:t>
       </w:r>
     </w:p>
     <w:p>
       <w:pPr>
         <w:keepNext/>
         <w:spacing w:before="120" w:after="60"/>
+        <w:rPr>
+          <w:b/>
+          <w:bCs/>
+        </w:rPr>
       </w:pPr>
       <w:r>
         <w:rPr>
           <w:rFonts w:cs="Times New Roman"/>
           <w:b/>
+          <w:bCs/>
           <w:i/>
           <w:color w:val="000000"/>
         </w:rPr>
-        <w:t>5.2 Pure-Python Data Science &amp; Statistical Algorithms (Spec v1.1)</w:t>
+        <w:t>5.2 Pure-Python Data Science &amp; Statistical Algorithms</w:t>
       </w:r>
     </w:p>
     <w:p>
       <w:pPr>
-        <w:spacing w:after="90"/>
+        <w:spacing w:after="76"/>
         <w:jc w:val="both"/>
       </w:pPr>
       <w:r>
@@ -3053,7 +2919,7 @@
     </w:p>
     <w:p>
       <w:pPr>
-        <w:spacing w:after="60"/>
+        <w:spacing w:after="44"/>
         <w:ind w:left="397" w:hanging="227"/>
         <w:jc w:val="both"/>
       </w:pPr>
@@ -3063,7 +2929,7 @@
           <w:b/>
           <w:color w:val="000000"/>
         </w:rPr>
-        <w:t xml:space="preserve">• 3-Tier Smart Categorization Engine ('src/analytics/tagger.py'): </w:t>
+        <w:t xml:space="preserve">• 3-Tier Smart Categorization Engine: </w:t>
       </w:r>
       <w:r>
         <w:rPr>
@@ -3075,7 +2941,7 @@
     </w:p>
     <w:p>
       <w:pPr>
-        <w:spacing w:after="60"/>
+        <w:spacing w:after="44"/>
         <w:ind w:left="397" w:hanging="227"/>
         <w:jc w:val="both"/>
       </w:pPr>
@@ -3085,7 +2951,7 @@
           <w:b/>
           <w:color w:val="000000"/>
         </w:rPr>
-        <w:t xml:space="preserve">• Zero-Variance Protected Z-Score Anomaly Engine ('src/analytics/anomaly.py'): </w:t>
+        <w:t xml:space="preserve">• Zero-Variance Protected Z-Score Anomaly Engine: </w:t>
       </w:r>
       <w:r>
         <w:rPr>
@@ -3097,7 +2963,7 @@
     </w:p>
     <w:p>
       <w:pPr>
-        <w:spacing w:after="60"/>
+        <w:spacing w:after="44"/>
         <w:ind w:left="397" w:hanging="227"/>
         <w:jc w:val="both"/>
       </w:pPr>
@@ -3107,7 +2973,7 @@
           <w:b/>
           <w:color w:val="000000"/>
         </w:rPr>
-        <w:t xml:space="preserve">• Clamped 0–100 Financial Health Score ('src/analytics/health_score.py'): </w:t>
+        <w:t xml:space="preserve">• Clamped 0–100 Financial Health Score Engine: </w:t>
       </w:r>
       <w:r>
         <w:rPr>
@@ -3121,15 +2987,20 @@
       <w:pPr>
         <w:keepNext/>
         <w:spacing w:before="120" w:after="60"/>
+        <w:rPr>
+          <w:b/>
+          <w:bCs/>
+        </w:rPr>
       </w:pPr>
       <w:r>
         <w:rPr>
           <w:rFonts w:cs="Times New Roman"/>
           <w:b/>
+          <w:bCs/>
           <w:i/>
           <w:color w:val="000000"/>
         </w:rPr>
-        <w:t>5.3 Normalized 6-Table SQLite v1.1 Database Schema</w:t>
+        <w:t>5.3 Normalized 6-Table Relational Database Schema (SQLite)</w:t>
       </w:r>
     </w:p>
     <w:tbl>
@@ -3160,10 +3031,10 @@
             </w:tcBorders>
             <w:shd w:val="clear" w:color="auto" w:fill="EFEFEF"/>
             <w:tcMar>
-              <w:top w:w="60" w:type="dxa"/>
-              <w:left w:w="85" w:type="dxa"/>
-              <w:bottom w:w="60" w:type="dxa"/>
-              <w:right w:w="85" w:type="dxa"/>
+              <w:top w:w="42" w:type="dxa"/>
+              <w:left w:w="80" w:type="dxa"/>
+              <w:bottom w:w="42" w:type="dxa"/>
+              <w:right w:w="80" w:type="dxa"/>
             </w:tcMar>
           </w:tcPr>
           <w:p>
@@ -3176,7 +3047,6 @@
                 <w:rFonts w:cs="Times New Roman"/>
                 <w:b/>
                 <w:color w:val="000000"/>
-                <w:sz w:val="22"/>
               </w:rPr>
               <w:t>SQLite Table Name</w:t>
             </w:r>
@@ -3193,10 +3063,10 @@
             </w:tcBorders>
             <w:shd w:val="clear" w:color="auto" w:fill="EFEFEF"/>
             <w:tcMar>
-              <w:top w:w="60" w:type="dxa"/>
-              <w:left w:w="85" w:type="dxa"/>
-              <w:bottom w:w="60" w:type="dxa"/>
-              <w:right w:w="85" w:type="dxa"/>
+              <w:top w:w="42" w:type="dxa"/>
+              <w:left w:w="80" w:type="dxa"/>
+              <w:bottom w:w="42" w:type="dxa"/>
+              <w:right w:w="80" w:type="dxa"/>
             </w:tcMar>
           </w:tcPr>
           <w:p>
@@ -3209,9 +3079,8 @@
                 <w:rFonts w:cs="Times New Roman"/>
                 <w:b/>
                 <w:color w:val="000000"/>
-                <w:sz w:val="22"/>
               </w:rPr>
-              <w:t>Primary Keys &amp; Schema Columns (v1.1)</w:t>
+              <w:t>Primary Keys &amp; Schema Columns</w:t>
             </w:r>
           </w:p>
         </w:tc>
@@ -3226,10 +3095,10 @@
             </w:tcBorders>
             <w:shd w:val="clear" w:color="auto" w:fill="EFEFEF"/>
             <w:tcMar>
-              <w:top w:w="60" w:type="dxa"/>
-              <w:left w:w="85" w:type="dxa"/>
-              <w:bottom w:w="60" w:type="dxa"/>
-              <w:right w:w="85" w:type="dxa"/>
+              <w:top w:w="42" w:type="dxa"/>
+              <w:left w:w="80" w:type="dxa"/>
+              <w:bottom w:w="42" w:type="dxa"/>
+              <w:right w:w="80" w:type="dxa"/>
             </w:tcMar>
           </w:tcPr>
           <w:p>
@@ -3242,7 +3111,6 @@
                 <w:rFonts w:cs="Times New Roman"/>
                 <w:b/>
                 <w:color w:val="000000"/>
-                <w:sz w:val="22"/>
               </w:rPr>
               <w:t>Architectural Role in Pipeline</w:t>
             </w:r>
@@ -3264,10 +3132,10 @@
               <w:right w:val="single" w:sz="4" w:space="0" w:color="000000"/>
             </w:tcBorders>
             <w:tcMar>
-              <w:top w:w="55" w:type="dxa"/>
-              <w:left w:w="85" w:type="dxa"/>
-              <w:bottom w:w="55" w:type="dxa"/>
-              <w:right w:w="85" w:type="dxa"/>
+              <w:top w:w="38" w:type="dxa"/>
+              <w:left w:w="80" w:type="dxa"/>
+              <w:bottom w:w="38" w:type="dxa"/>
+              <w:right w:w="80" w:type="dxa"/>
             </w:tcMar>
           </w:tcPr>
           <w:p>
@@ -3279,7 +3147,6 @@
                 <w:rFonts w:cs="Times New Roman"/>
                 <w:b/>
                 <w:color w:val="000000"/>
-                <w:sz w:val="22"/>
               </w:rPr>
               <w:t>1. user_profile</w:t>
             </w:r>
@@ -3295,10 +3162,10 @@
               <w:right w:val="single" w:sz="4" w:space="0" w:color="000000"/>
             </w:tcBorders>
             <w:tcMar>
-              <w:top w:w="55" w:type="dxa"/>
-              <w:left w:w="85" w:type="dxa"/>
-              <w:bottom w:w="55" w:type="dxa"/>
-              <w:right w:w="85" w:type="dxa"/>
+              <w:top w:w="38" w:type="dxa"/>
+              <w:left w:w="80" w:type="dxa"/>
+              <w:bottom w:w="38" w:type="dxa"/>
+              <w:right w:w="80" w:type="dxa"/>
             </w:tcMar>
           </w:tcPr>
           <w:p>
@@ -3309,7 +3176,6 @@
               <w:rPr>
                 <w:rFonts w:cs="Times New Roman"/>
                 <w:color w:val="000000"/>
-                <w:sz w:val="22"/>
               </w:rPr>
               <w:t>user_id (PK), user_name, upi_id, monthly_budget, preferred_upi_app, biometric_enabled</w:t>
             </w:r>
@@ -3325,10 +3191,10 @@
               <w:right w:val="single" w:sz="4" w:space="0" w:color="000000"/>
             </w:tcBorders>
             <w:tcMar>
-              <w:top w:w="55" w:type="dxa"/>
-              <w:left w:w="85" w:type="dxa"/>
-              <w:bottom w:w="55" w:type="dxa"/>
-              <w:right w:w="85" w:type="dxa"/>
+              <w:top w:w="38" w:type="dxa"/>
+              <w:left w:w="80" w:type="dxa"/>
+              <w:bottom w:w="38" w:type="dxa"/>
+              <w:right w:w="80" w:type="dxa"/>
             </w:tcMar>
           </w:tcPr>
           <w:p>
@@ -3339,7 +3205,6 @@
               <w:rPr>
                 <w:rFonts w:cs="Times New Roman"/>
                 <w:color w:val="000000"/>
-                <w:sz w:val="22"/>
               </w:rPr>
               <w:t>Stores user budget configuration (default Rs. 12,000) and security flags.</w:t>
             </w:r>
@@ -3361,10 +3226,10 @@
               <w:right w:val="single" w:sz="4" w:space="0" w:color="000000"/>
             </w:tcBorders>
             <w:tcMar>
-              <w:top w:w="55" w:type="dxa"/>
-              <w:left w:w="85" w:type="dxa"/>
-              <w:bottom w:w="55" w:type="dxa"/>
-              <w:right w:w="85" w:type="dxa"/>
+              <w:top w:w="38" w:type="dxa"/>
+              <w:left w:w="80" w:type="dxa"/>
+              <w:bottom w:w="38" w:type="dxa"/>
+              <w:right w:w="80" w:type="dxa"/>
             </w:tcMar>
           </w:tcPr>
           <w:p>
@@ -3376,7 +3241,6 @@
                 <w:rFonts w:cs="Times New Roman"/>
                 <w:b/>
                 <w:color w:val="000000"/>
-                <w:sz w:val="22"/>
               </w:rPr>
               <w:t>2. categories</w:t>
             </w:r>
@@ -3392,10 +3256,10 @@
               <w:right w:val="single" w:sz="4" w:space="0" w:color="000000"/>
             </w:tcBorders>
             <w:tcMar>
-              <w:top w:w="55" w:type="dxa"/>
-              <w:left w:w="85" w:type="dxa"/>
-              <w:bottom w:w="55" w:type="dxa"/>
-              <w:right w:w="85" w:type="dxa"/>
+              <w:top w:w="38" w:type="dxa"/>
+              <w:left w:w="80" w:type="dxa"/>
+              <w:bottom w:w="38" w:type="dxa"/>
+              <w:right w:w="80" w:type="dxa"/>
             </w:tcMar>
           </w:tcPr>
           <w:p>
@@ -3406,7 +3270,6 @@
               <w:rPr>
                 <w:rFonts w:cs="Times New Roman"/>
                 <w:color w:val="000000"/>
-                <w:sz w:val="22"/>
               </w:rPr>
               <w:t>category_id (PK), name, budget_limit, icon_name</w:t>
             </w:r>
@@ -3422,10 +3285,10 @@
               <w:right w:val="single" w:sz="4" w:space="0" w:color="000000"/>
             </w:tcBorders>
             <w:tcMar>
-              <w:top w:w="55" w:type="dxa"/>
-              <w:left w:w="85" w:type="dxa"/>
-              <w:bottom w:w="55" w:type="dxa"/>
-              <w:right w:w="85" w:type="dxa"/>
+              <w:top w:w="38" w:type="dxa"/>
+              <w:left w:w="80" w:type="dxa"/>
+              <w:bottom w:w="38" w:type="dxa"/>
+              <w:right w:w="80" w:type="dxa"/>
             </w:tcMar>
           </w:tcPr>
           <w:p>
@@ -3436,7 +3299,6 @@
               <w:rPr>
                 <w:rFonts w:cs="Times New Roman"/>
                 <w:color w:val="000000"/>
-                <w:sz w:val="22"/>
               </w:rPr>
               <w:t>Stores 6 default budget categories (Food, Travel, Groceries, Fuel, Utilities, Uncategorized).</w:t>
             </w:r>
@@ -3458,10 +3320,10 @@
               <w:right w:val="single" w:sz="4" w:space="0" w:color="000000"/>
             </w:tcBorders>
             <w:tcMar>
-              <w:top w:w="55" w:type="dxa"/>
-              <w:left w:w="85" w:type="dxa"/>
-              <w:bottom w:w="55" w:type="dxa"/>
-              <w:right w:w="85" w:type="dxa"/>
+              <w:top w:w="38" w:type="dxa"/>
+              <w:left w:w="80" w:type="dxa"/>
+              <w:bottom w:w="38" w:type="dxa"/>
+              <w:right w:w="80" w:type="dxa"/>
             </w:tcMar>
           </w:tcPr>
           <w:p>
@@ -3473,9 +3335,7 @@
                 <w:rFonts w:cs="Times New Roman"/>
                 <w:b/>
                 <w:color w:val="000000"/>
-                <w:sz w:val="22"/>
               </w:rPr>
-              <w:lastRenderedPageBreak/>
               <w:t>3. transactions</w:t>
             </w:r>
           </w:p>
@@ -3490,10 +3350,10 @@
               <w:right w:val="single" w:sz="4" w:space="0" w:color="000000"/>
             </w:tcBorders>
             <w:tcMar>
-              <w:top w:w="55" w:type="dxa"/>
-              <w:left w:w="85" w:type="dxa"/>
-              <w:bottom w:w="55" w:type="dxa"/>
-              <w:right w:w="85" w:type="dxa"/>
+              <w:top w:w="38" w:type="dxa"/>
+              <w:left w:w="80" w:type="dxa"/>
+              <w:bottom w:w="38" w:type="dxa"/>
+              <w:right w:w="80" w:type="dxa"/>
             </w:tcMar>
           </w:tcPr>
           <w:p>
@@ -3504,7 +3364,6 @@
               <w:rPr>
                 <w:rFonts w:cs="Times New Roman"/>
                 <w:color w:val="000000"/>
-                <w:sz w:val="22"/>
               </w:rPr>
               <w:t>txn_id (PK), amount, payee_vpa, payee_name, timestamp, category_id (FK), is_anomaly, notes</w:t>
             </w:r>
@@ -3520,10 +3379,10 @@
               <w:right w:val="single" w:sz="4" w:space="0" w:color="000000"/>
             </w:tcBorders>
             <w:tcMar>
-              <w:top w:w="55" w:type="dxa"/>
-              <w:left w:w="85" w:type="dxa"/>
-              <w:bottom w:w="55" w:type="dxa"/>
-              <w:right w:w="85" w:type="dxa"/>
+              <w:top w:w="38" w:type="dxa"/>
+              <w:left w:w="80" w:type="dxa"/>
+              <w:bottom w:w="38" w:type="dxa"/>
+              <w:right w:w="80" w:type="dxa"/>
             </w:tcMar>
           </w:tcPr>
           <w:p>
@@ -3534,7 +3393,6 @@
               <w:rPr>
                 <w:rFonts w:cs="Times New Roman"/>
                 <w:color w:val="000000"/>
-                <w:sz w:val="22"/>
               </w:rPr>
               <w:t>Master verified passbook ledger powering dashboard charts and Z-Score history.</w:t>
             </w:r>
@@ -3556,10 +3414,10 @@
               <w:right w:val="single" w:sz="4" w:space="0" w:color="000000"/>
             </w:tcBorders>
             <w:tcMar>
-              <w:top w:w="55" w:type="dxa"/>
-              <w:left w:w="85" w:type="dxa"/>
-              <w:bottom w:w="55" w:type="dxa"/>
-              <w:right w:w="85" w:type="dxa"/>
+              <w:top w:w="38" w:type="dxa"/>
+              <w:left w:w="80" w:type="dxa"/>
+              <w:bottom w:w="38" w:type="dxa"/>
+              <w:right w:w="80" w:type="dxa"/>
             </w:tcMar>
           </w:tcPr>
           <w:p>
@@ -3571,8 +3429,8 @@
                 <w:rFonts w:cs="Times New Roman"/>
                 <w:b/>
                 <w:color w:val="000000"/>
-                <w:sz w:val="22"/>
               </w:rPr>
+              <w:lastRenderedPageBreak/>
               <w:t>4. pending_transactions</w:t>
             </w:r>
           </w:p>
@@ -3587,10 +3445,10 @@
               <w:right w:val="single" w:sz="4" w:space="0" w:color="000000"/>
             </w:tcBorders>
             <w:tcMar>
-              <w:top w:w="55" w:type="dxa"/>
-              <w:left w:w="85" w:type="dxa"/>
-              <w:bottom w:w="55" w:type="dxa"/>
-              <w:right w:w="85" w:type="dxa"/>
+              <w:top w:w="38" w:type="dxa"/>
+              <w:left w:w="80" w:type="dxa"/>
+              <w:bottom w:w="38" w:type="dxa"/>
+              <w:right w:w="80" w:type="dxa"/>
             </w:tcMar>
           </w:tcPr>
           <w:p>
@@ -3601,7 +3459,6 @@
               <w:rPr>
                 <w:rFonts w:cs="Times New Roman"/>
                 <w:color w:val="000000"/>
-                <w:sz w:val="22"/>
               </w:rPr>
               <w:t>internal_id (PK AUTOINCREMENT), amount, payee_vpa, payee_name, raw_qr_uri, init_time, status</w:t>
             </w:r>
@@ -3617,10 +3474,10 @@
               <w:right w:val="single" w:sz="4" w:space="0" w:color="000000"/>
             </w:tcBorders>
             <w:tcMar>
-              <w:top w:w="55" w:type="dxa"/>
-              <w:left w:w="85" w:type="dxa"/>
-              <w:bottom w:w="55" w:type="dxa"/>
-              <w:right w:w="85" w:type="dxa"/>
+              <w:top w:w="38" w:type="dxa"/>
+              <w:left w:w="80" w:type="dxa"/>
+              <w:bottom w:w="38" w:type="dxa"/>
+              <w:right w:w="80" w:type="dxa"/>
             </w:tcMar>
           </w:tcPr>
           <w:p>
@@ -3631,7 +3488,6 @@
               <w:rPr>
                 <w:rFonts w:cs="Times New Roman"/>
                 <w:color w:val="000000"/>
-                <w:sz w:val="22"/>
               </w:rPr>
               <w:t>Pre-intent state preservation table resolved strictly via WHERE internal_id = ?.</w:t>
             </w:r>
@@ -3653,10 +3509,10 @@
               <w:right w:val="single" w:sz="4" w:space="0" w:color="000000"/>
             </w:tcBorders>
             <w:tcMar>
-              <w:top w:w="55" w:type="dxa"/>
-              <w:left w:w="85" w:type="dxa"/>
-              <w:bottom w:w="55" w:type="dxa"/>
-              <w:right w:w="85" w:type="dxa"/>
+              <w:top w:w="38" w:type="dxa"/>
+              <w:left w:w="80" w:type="dxa"/>
+              <w:bottom w:w="38" w:type="dxa"/>
+              <w:right w:w="80" w:type="dxa"/>
             </w:tcMar>
           </w:tcPr>
           <w:p>
@@ -3668,7 +3524,6 @@
                 <w:rFonts w:cs="Times New Roman"/>
                 <w:b/>
                 <w:color w:val="000000"/>
-                <w:sz w:val="22"/>
               </w:rPr>
               <w:t>5. merchant_tags</w:t>
             </w:r>
@@ -3684,10 +3539,10 @@
               <w:right w:val="single" w:sz="4" w:space="0" w:color="000000"/>
             </w:tcBorders>
             <w:tcMar>
-              <w:top w:w="55" w:type="dxa"/>
-              <w:left w:w="85" w:type="dxa"/>
-              <w:bottom w:w="55" w:type="dxa"/>
-              <w:right w:w="85" w:type="dxa"/>
+              <w:top w:w="38" w:type="dxa"/>
+              <w:left w:w="80" w:type="dxa"/>
+              <w:bottom w:w="38" w:type="dxa"/>
+              <w:right w:w="80" w:type="dxa"/>
             </w:tcMar>
           </w:tcPr>
           <w:p>
@@ -3698,7 +3553,6 @@
               <w:rPr>
                 <w:rFonts w:cs="Times New Roman"/>
                 <w:color w:val="000000"/>
-                <w:sz w:val="22"/>
               </w:rPr>
               <w:t>vpa_pattern (PK), category_id (FK), confidence</w:t>
             </w:r>
@@ -3714,10 +3568,10 @@
               <w:right w:val="single" w:sz="4" w:space="0" w:color="000000"/>
             </w:tcBorders>
             <w:tcMar>
-              <w:top w:w="55" w:type="dxa"/>
-              <w:left w:w="85" w:type="dxa"/>
-              <w:bottom w:w="55" w:type="dxa"/>
-              <w:right w:w="85" w:type="dxa"/>
+              <w:top w:w="38" w:type="dxa"/>
+              <w:left w:w="80" w:type="dxa"/>
+              <w:bottom w:w="38" w:type="dxa"/>
+              <w:right w:w="80" w:type="dxa"/>
             </w:tcMar>
           </w:tcPr>
           <w:p>
@@ -3728,7 +3582,6 @@
               <w:rPr>
                 <w:rFonts w:cs="Times New Roman"/>
                 <w:color w:val="000000"/>
-                <w:sz w:val="22"/>
               </w:rPr>
               <w:t>Tier 1 O(1) user-learned VPA-to-category mapping cache for repeat merchants.</w:t>
             </w:r>
@@ -3750,10 +3603,10 @@
               <w:right w:val="single" w:sz="4" w:space="0" w:color="000000"/>
             </w:tcBorders>
             <w:tcMar>
-              <w:top w:w="55" w:type="dxa"/>
-              <w:left w:w="85" w:type="dxa"/>
-              <w:bottom w:w="55" w:type="dxa"/>
-              <w:right w:w="85" w:type="dxa"/>
+              <w:top w:w="38" w:type="dxa"/>
+              <w:left w:w="80" w:type="dxa"/>
+              <w:bottom w:w="38" w:type="dxa"/>
+              <w:right w:w="80" w:type="dxa"/>
             </w:tcMar>
           </w:tcPr>
           <w:p>
@@ -3765,7 +3618,6 @@
                 <w:rFonts w:cs="Times New Roman"/>
                 <w:b/>
                 <w:color w:val="000000"/>
-                <w:sz w:val="22"/>
               </w:rPr>
               <w:t>6. bill_splits</w:t>
             </w:r>
@@ -3781,10 +3633,10 @@
               <w:right w:val="single" w:sz="4" w:space="0" w:color="000000"/>
             </w:tcBorders>
             <w:tcMar>
-              <w:top w:w="55" w:type="dxa"/>
-              <w:left w:w="85" w:type="dxa"/>
-              <w:bottom w:w="55" w:type="dxa"/>
-              <w:right w:w="85" w:type="dxa"/>
+              <w:top w:w="38" w:type="dxa"/>
+              <w:left w:w="80" w:type="dxa"/>
+              <w:bottom w:w="38" w:type="dxa"/>
+              <w:right w:w="80" w:type="dxa"/>
             </w:tcMar>
           </w:tcPr>
           <w:p>
@@ -3795,7 +3647,6 @@
               <w:rPr>
                 <w:rFonts w:cs="Times New Roman"/>
                 <w:color w:val="000000"/>
-                <w:sz w:val="22"/>
               </w:rPr>
               <w:t>split_id (PK AUTOINCREMENT), txn_id (FK), friend_name, friend_contact, share_amount, is_settled</w:t>
             </w:r>
@@ -3811,10 +3662,10 @@
               <w:right w:val="single" w:sz="4" w:space="0" w:color="000000"/>
             </w:tcBorders>
             <w:tcMar>
-              <w:top w:w="55" w:type="dxa"/>
-              <w:left w:w="85" w:type="dxa"/>
-              <w:bottom w:w="55" w:type="dxa"/>
-              <w:right w:w="85" w:type="dxa"/>
+              <w:top w:w="38" w:type="dxa"/>
+              <w:left w:w="80" w:type="dxa"/>
+              <w:bottom w:w="38" w:type="dxa"/>
+              <w:right w:w="80" w:type="dxa"/>
             </w:tcMar>
           </w:tcPr>
           <w:p>
@@ -3825,9 +3676,8 @@
               <w:rPr>
                 <w:rFonts w:cs="Times New Roman"/>
                 <w:color w:val="000000"/>
-                <w:sz w:val="22"/>
               </w:rPr>
-              <w:t>Supports SRS REQ-15 post-payment peer bill splitting and settlement tracking.</w:t>
+              <w:t>Supports post-payment peer bill splitting and settlement tracking.</w:t>
             </w:r>
           </w:p>
         </w:tc>
@@ -3841,7 +3691,7 @@
     <w:p>
       <w:pPr>
         <w:keepNext/>
-        <w:spacing w:before="200"/>
+        <w:spacing w:before="160"/>
       </w:pPr>
       <w:r>
         <w:rPr>
@@ -3855,7 +3705,7 @@
     </w:p>
     <w:p>
       <w:pPr>
-        <w:spacing w:after="90"/>
+        <w:spacing w:after="76"/>
         <w:jc w:val="both"/>
       </w:pPr>
       <w:r>
@@ -3870,11 +3720,16 @@
       <w:pPr>
         <w:keepNext/>
         <w:spacing w:before="120" w:after="60"/>
+        <w:rPr>
+          <w:b/>
+          <w:bCs/>
+        </w:rPr>
       </w:pPr>
       <w:r>
         <w:rPr>
           <w:rFonts w:cs="Times New Roman"/>
           <w:b/>
+          <w:bCs/>
           <w:i/>
           <w:color w:val="000000"/>
         </w:rPr>
@@ -3908,10 +3763,10 @@
             </w:tcBorders>
             <w:shd w:val="clear" w:color="auto" w:fill="EFEFEF"/>
             <w:tcMar>
-              <w:top w:w="60" w:type="dxa"/>
-              <w:left w:w="85" w:type="dxa"/>
-              <w:bottom w:w="60" w:type="dxa"/>
-              <w:right w:w="85" w:type="dxa"/>
+              <w:top w:w="42" w:type="dxa"/>
+              <w:left w:w="80" w:type="dxa"/>
+              <w:bottom w:w="42" w:type="dxa"/>
+              <w:right w:w="80" w:type="dxa"/>
             </w:tcMar>
           </w:tcPr>
           <w:p>
@@ -3924,7 +3779,6 @@
                 <w:rFonts w:cs="Times New Roman"/>
                 <w:b/>
                 <w:color w:val="000000"/>
-                <w:sz w:val="22"/>
               </w:rPr>
               <w:t>Requirement Category</w:t>
             </w:r>
@@ -3941,10 +3795,10 @@
             </w:tcBorders>
             <w:shd w:val="clear" w:color="auto" w:fill="EFEFEF"/>
             <w:tcMar>
-              <w:top w:w="60" w:type="dxa"/>
-              <w:left w:w="85" w:type="dxa"/>
-              <w:bottom w:w="60" w:type="dxa"/>
-              <w:right w:w="85" w:type="dxa"/>
+              <w:top w:w="42" w:type="dxa"/>
+              <w:left w:w="80" w:type="dxa"/>
+              <w:bottom w:w="42" w:type="dxa"/>
+              <w:right w:w="80" w:type="dxa"/>
             </w:tcMar>
           </w:tcPr>
           <w:p>
@@ -3957,9 +3811,8 @@
                 <w:rFonts w:cs="Times New Roman"/>
                 <w:b/>
                 <w:color w:val="000000"/>
-                <w:sz w:val="22"/>
               </w:rPr>
-              <w:t>Technical Specification &amp; Version Guardrails</w:t>
+              <w:t>Technical Specification &amp; System Guardrails</w:t>
             </w:r>
           </w:p>
         </w:tc>
@@ -3979,10 +3832,10 @@
               <w:right w:val="single" w:sz="4" w:space="0" w:color="000000"/>
             </w:tcBorders>
             <w:tcMar>
-              <w:top w:w="55" w:type="dxa"/>
-              <w:left w:w="85" w:type="dxa"/>
-              <w:bottom w:w="55" w:type="dxa"/>
-              <w:right w:w="85" w:type="dxa"/>
+              <w:top w:w="38" w:type="dxa"/>
+              <w:left w:w="80" w:type="dxa"/>
+              <w:bottom w:w="38" w:type="dxa"/>
+              <w:right w:w="80" w:type="dxa"/>
             </w:tcMar>
           </w:tcPr>
           <w:p>
@@ -3994,7 +3847,6 @@
                 <w:rFonts w:cs="Times New Roman"/>
                 <w:b/>
                 <w:color w:val="000000"/>
-                <w:sz w:val="22"/>
               </w:rPr>
               <w:t>Target Mobile Device (Android)</w:t>
             </w:r>
@@ -4010,10 +3862,10 @@
               <w:right w:val="single" w:sz="4" w:space="0" w:color="000000"/>
             </w:tcBorders>
             <w:tcMar>
-              <w:top w:w="55" w:type="dxa"/>
-              <w:left w:w="85" w:type="dxa"/>
-              <w:bottom w:w="55" w:type="dxa"/>
-              <w:right w:w="85" w:type="dxa"/>
+              <w:top w:w="38" w:type="dxa"/>
+              <w:left w:w="80" w:type="dxa"/>
+              <w:bottom w:w="38" w:type="dxa"/>
+              <w:right w:w="80" w:type="dxa"/>
             </w:tcMar>
           </w:tcPr>
           <w:p>
@@ -4024,7 +3876,6 @@
               <w:rPr>
                 <w:rFonts w:cs="Times New Roman"/>
                 <w:color w:val="000000"/>
-                <w:sz w:val="22"/>
               </w:rPr>
               <w:t>Android 8.0 (API Level 26) or higher; ARM64/ARMv7 processor; Minimum 2 GB RAM; 50 MB free storage; Rear camera for QR scanning; Installed UPI app (GPay / PhonePe / Paytm / BHIM).</w:t>
             </w:r>
@@ -4046,10 +3897,10 @@
               <w:right w:val="single" w:sz="4" w:space="0" w:color="000000"/>
             </w:tcBorders>
             <w:tcMar>
-              <w:top w:w="55" w:type="dxa"/>
-              <w:left w:w="85" w:type="dxa"/>
-              <w:bottom w:w="55" w:type="dxa"/>
-              <w:right w:w="85" w:type="dxa"/>
+              <w:top w:w="38" w:type="dxa"/>
+              <w:left w:w="80" w:type="dxa"/>
+              <w:bottom w:w="38" w:type="dxa"/>
+              <w:right w:w="80" w:type="dxa"/>
             </w:tcMar>
           </w:tcPr>
           <w:p>
@@ -4061,7 +3912,6 @@
                 <w:rFonts w:cs="Times New Roman"/>
                 <w:b/>
                 <w:color w:val="000000"/>
-                <w:sz w:val="22"/>
               </w:rPr>
               <w:t>Development Workstation</w:t>
             </w:r>
@@ -4077,10 +3927,10 @@
               <w:right w:val="single" w:sz="4" w:space="0" w:color="000000"/>
             </w:tcBorders>
             <w:tcMar>
-              <w:top w:w="55" w:type="dxa"/>
-              <w:left w:w="85" w:type="dxa"/>
-              <w:bottom w:w="55" w:type="dxa"/>
-              <w:right w:w="85" w:type="dxa"/>
+              <w:top w:w="38" w:type="dxa"/>
+              <w:left w:w="80" w:type="dxa"/>
+              <w:bottom w:w="38" w:type="dxa"/>
+              <w:right w:w="80" w:type="dxa"/>
             </w:tcMar>
           </w:tcPr>
           <w:p>
@@ -4091,7 +3941,6 @@
               <w:rPr>
                 <w:rFonts w:cs="Times New Roman"/>
                 <w:color w:val="000000"/>
-                <w:sz w:val="22"/>
               </w:rPr>
               <w:t>Intel Core i3 / AMD Ryzen 3 or higher; 8 GB RAM (16 GB recommended); 2 GB free disk space; Windows 10/11, Ubuntu Linux 22.04+, or macOS.</w:t>
             </w:r>
@@ -4113,10 +3962,10 @@
               <w:right w:val="single" w:sz="4" w:space="0" w:color="000000"/>
             </w:tcBorders>
             <w:tcMar>
-              <w:top w:w="55" w:type="dxa"/>
-              <w:left w:w="85" w:type="dxa"/>
-              <w:bottom w:w="55" w:type="dxa"/>
-              <w:right w:w="85" w:type="dxa"/>
+              <w:top w:w="38" w:type="dxa"/>
+              <w:left w:w="80" w:type="dxa"/>
+              <w:bottom w:w="38" w:type="dxa"/>
+              <w:right w:w="80" w:type="dxa"/>
             </w:tcMar>
           </w:tcPr>
           <w:p>
@@ -4128,7 +3977,6 @@
                 <w:rFonts w:cs="Times New Roman"/>
                 <w:b/>
                 <w:color w:val="000000"/>
-                <w:sz w:val="22"/>
               </w:rPr>
               <w:t>Core Programming Language</w:t>
             </w:r>
@@ -4144,10 +3992,10 @@
               <w:right w:val="single" w:sz="4" w:space="0" w:color="000000"/>
             </w:tcBorders>
             <w:tcMar>
-              <w:top w:w="55" w:type="dxa"/>
-              <w:left w:w="85" w:type="dxa"/>
-              <w:bottom w:w="55" w:type="dxa"/>
-              <w:right w:w="85" w:type="dxa"/>
+              <w:top w:w="38" w:type="dxa"/>
+              <w:left w:w="80" w:type="dxa"/>
+              <w:bottom w:w="38" w:type="dxa"/>
+              <w:right w:w="80" w:type="dxa"/>
             </w:tcMar>
           </w:tcPr>
           <w:p>
@@ -4158,7 +4006,6 @@
               <w:rPr>
                 <w:rFonts w:cs="Times New Roman"/>
                 <w:color w:val="000000"/>
-                <w:sz w:val="22"/>
               </w:rPr>
               <w:t>Python 3.11+ (Pure Python Standard Library for Analytics: re, statistics, math, csv, sqlite3, urllib.parse, datetime).</w:t>
             </w:r>
@@ -4180,10 +4027,10 @@
               <w:right w:val="single" w:sz="4" w:space="0" w:color="000000"/>
             </w:tcBorders>
             <w:tcMar>
-              <w:top w:w="55" w:type="dxa"/>
-              <w:left w:w="85" w:type="dxa"/>
-              <w:bottom w:w="55" w:type="dxa"/>
-              <w:right w:w="85" w:type="dxa"/>
+              <w:top w:w="38" w:type="dxa"/>
+              <w:left w:w="80" w:type="dxa"/>
+              <w:bottom w:w="38" w:type="dxa"/>
+              <w:right w:w="80" w:type="dxa"/>
             </w:tcMar>
           </w:tcPr>
           <w:p>
@@ -4195,7 +4042,6 @@
                 <w:rFonts w:cs="Times New Roman"/>
                 <w:b/>
                 <w:color w:val="000000"/>
-                <w:sz w:val="22"/>
               </w:rPr>
               <w:t>Frontend UI Framework</w:t>
             </w:r>
@@ -4211,10 +4057,10 @@
               <w:right w:val="single" w:sz="4" w:space="0" w:color="000000"/>
             </w:tcBorders>
             <w:tcMar>
-              <w:top w:w="55" w:type="dxa"/>
-              <w:left w:w="85" w:type="dxa"/>
-              <w:bottom w:w="55" w:type="dxa"/>
-              <w:right w:w="85" w:type="dxa"/>
+              <w:top w:w="38" w:type="dxa"/>
+              <w:left w:w="80" w:type="dxa"/>
+              <w:bottom w:w="38" w:type="dxa"/>
+              <w:right w:w="80" w:type="dxa"/>
             </w:tcMar>
           </w:tcPr>
           <w:p>
@@ -4225,9 +4071,8 @@
               <w:rPr>
                 <w:rFonts w:cs="Times New Roman"/>
                 <w:color w:val="000000"/>
-                <w:sz w:val="22"/>
               </w:rPr>
-              <w:t>Flet 1.0+ / 0.80+ (Flutter-based reactive Python UI framework rendering 435x860 dark-mode mobile viewport &amp; native charts).</w:t>
+              <w:t>Flet (Flutter-based reactive Python UI framework rendering a dark-mode mobile viewport, lifecycle listeners, and native charts).</w:t>
             </w:r>
           </w:p>
         </w:tc>
@@ -4247,10 +4092,10 @@
               <w:right w:val="single" w:sz="4" w:space="0" w:color="000000"/>
             </w:tcBorders>
             <w:tcMar>
-              <w:top w:w="55" w:type="dxa"/>
-              <w:left w:w="85" w:type="dxa"/>
-              <w:bottom w:w="55" w:type="dxa"/>
-              <w:right w:w="85" w:type="dxa"/>
+              <w:top w:w="38" w:type="dxa"/>
+              <w:left w:w="80" w:type="dxa"/>
+              <w:bottom w:w="38" w:type="dxa"/>
+              <w:right w:w="80" w:type="dxa"/>
             </w:tcMar>
           </w:tcPr>
           <w:p>
@@ -4262,7 +4107,6 @@
                 <w:rFonts w:cs="Times New Roman"/>
                 <w:b/>
                 <w:color w:val="000000"/>
-                <w:sz w:val="22"/>
               </w:rPr>
               <w:t>Database &amp; Security Layer</w:t>
             </w:r>
@@ -4278,10 +4122,10 @@
               <w:right w:val="single" w:sz="4" w:space="0" w:color="000000"/>
             </w:tcBorders>
             <w:tcMar>
-              <w:top w:w="55" w:type="dxa"/>
-              <w:left w:w="85" w:type="dxa"/>
-              <w:bottom w:w="55" w:type="dxa"/>
-              <w:right w:w="85" w:type="dxa"/>
+              <w:top w:w="38" w:type="dxa"/>
+              <w:left w:w="80" w:type="dxa"/>
+              <w:bottom w:w="38" w:type="dxa"/>
+              <w:right w:w="80" w:type="dxa"/>
             </w:tcMar>
           </w:tcPr>
           <w:p>
@@ -4292,7 +4136,6 @@
               <w:rPr>
                 <w:rFonts w:cs="Times New Roman"/>
                 <w:color w:val="000000"/>
-                <w:sz w:val="22"/>
               </w:rPr>
               <w:t>SQLite 3.x with SQLCipher 256-bit AES encryption (sqlcipher3) and Android Keystore / BiometricPrompt API via PyJNIus.</w:t>
             </w:r>
@@ -4314,10 +4157,10 @@
               <w:right w:val="single" w:sz="4" w:space="0" w:color="000000"/>
             </w:tcBorders>
             <w:tcMar>
-              <w:top w:w="55" w:type="dxa"/>
-              <w:left w:w="85" w:type="dxa"/>
-              <w:bottom w:w="55" w:type="dxa"/>
-              <w:right w:w="85" w:type="dxa"/>
+              <w:top w:w="38" w:type="dxa"/>
+              <w:left w:w="80" w:type="dxa"/>
+              <w:bottom w:w="38" w:type="dxa"/>
+              <w:right w:w="80" w:type="dxa"/>
             </w:tcMar>
           </w:tcPr>
           <w:p>
@@ -4329,9 +4172,8 @@
                 <w:rFonts w:cs="Times New Roman"/>
                 <w:b/>
                 <w:color w:val="000000"/>
-                <w:sz w:val="22"/>
               </w:rPr>
-              <w:t>Forbidden Heavy Libraries</w:t>
+              <w:t>Excluded Heavy Libraries</w:t>
             </w:r>
           </w:p>
         </w:tc>
@@ -4345,10 +4187,10 @@
               <w:right w:val="single" w:sz="4" w:space="0" w:color="000000"/>
             </w:tcBorders>
             <w:tcMar>
-              <w:top w:w="55" w:type="dxa"/>
-              <w:left w:w="85" w:type="dxa"/>
-              <w:bottom w:w="55" w:type="dxa"/>
-              <w:right w:w="85" w:type="dxa"/>
+              <w:top w:w="38" w:type="dxa"/>
+              <w:left w:w="80" w:type="dxa"/>
+              <w:bottom w:w="38" w:type="dxa"/>
+              <w:right w:w="80" w:type="dxa"/>
             </w:tcMar>
           </w:tcPr>
           <w:p>
@@ -4359,9 +4201,8 @@
               <w:rPr>
                 <w:rFonts w:cs="Times New Roman"/>
                 <w:color w:val="000000"/>
-                <w:sz w:val="22"/>
               </w:rPr>
-              <w:t>Strictly ZERO Pandas, NumPy, SciPy, Scikit-learn, Matplotlib, or Plotly imports (enforced automatically via 'python main.py --check-integration').</w:t>
+              <w:t>Strictly ZERO Pandas, NumPy, SciPy, Scikit-learn, Matplotlib, or Plotly dependencies to maintain &lt;500 ms launch speed and compact APK size.</w:t>
             </w:r>
           </w:p>
         </w:tc>
@@ -4381,10 +4222,10 @@
               <w:right w:val="single" w:sz="4" w:space="0" w:color="000000"/>
             </w:tcBorders>
             <w:tcMar>
-              <w:top w:w="55" w:type="dxa"/>
-              <w:left w:w="85" w:type="dxa"/>
-              <w:bottom w:w="55" w:type="dxa"/>
-              <w:right w:w="85" w:type="dxa"/>
+              <w:top w:w="38" w:type="dxa"/>
+              <w:left w:w="80" w:type="dxa"/>
+              <w:bottom w:w="38" w:type="dxa"/>
+              <w:right w:w="80" w:type="dxa"/>
             </w:tcMar>
           </w:tcPr>
           <w:p>
@@ -4396,9 +4237,9 @@
                 <w:rFonts w:cs="Times New Roman"/>
                 <w:b/>
                 <w:color w:val="000000"/>
-                <w:sz w:val="22"/>
               </w:rPr>
-              <w:t>Version Control &amp; Agile Tooling</w:t>
+              <w:lastRenderedPageBreak/>
+              <w:t>Version Control &amp; Testing</w:t>
             </w:r>
           </w:p>
         </w:tc>
@@ -4412,10 +4253,10 @@
               <w:right w:val="single" w:sz="4" w:space="0" w:color="000000"/>
             </w:tcBorders>
             <w:tcMar>
-              <w:top w:w="55" w:type="dxa"/>
-              <w:left w:w="85" w:type="dxa"/>
-              <w:bottom w:w="55" w:type="dxa"/>
-              <w:right w:w="85" w:type="dxa"/>
+              <w:top w:w="38" w:type="dxa"/>
+              <w:left w:w="80" w:type="dxa"/>
+              <w:bottom w:w="38" w:type="dxa"/>
+              <w:right w:w="80" w:type="dxa"/>
             </w:tcMar>
           </w:tcPr>
           <w:p>
@@ -4426,9 +4267,8 @@
               <w:rPr>
                 <w:rFonts w:cs="Times New Roman"/>
                 <w:color w:val="000000"/>
-                <w:sz w:val="22"/>
               </w:rPr>
-              <w:t>Git &amp; GitHub (protected main and dev branches, role-isolated src/ directories, and 6-point Pre-PR CLI Gatekeeper Audit).</w:t>
+              <w:t>Git &amp; GitHub with modular package isolation and automated CLI integration verification.</w:t>
             </w:r>
           </w:p>
         </w:tc>
@@ -4443,21 +4283,25 @@
       <w:pPr>
         <w:keepNext/>
         <w:spacing w:before="120" w:after="60"/>
+        <w:rPr>
+          <w:b/>
+          <w:bCs/>
+        </w:rPr>
       </w:pPr>
       <w:r>
         <w:rPr>
           <w:rFonts w:cs="Times New Roman"/>
           <w:b/>
+          <w:bCs/>
           <w:i/>
           <w:color w:val="000000"/>
         </w:rPr>
-        <w:lastRenderedPageBreak/>
-        <w:t>6.2 Summary of Key Functional &amp; Non-Functional Requirements</w:t>
+        <w:t>6.2 Summary of Functional &amp; Non-Functional Requirements</w:t>
       </w:r>
     </w:p>
     <w:p>
       <w:pPr>
-        <w:spacing w:after="60"/>
+        <w:spacing w:after="44"/>
         <w:ind w:left="397" w:hanging="227"/>
         <w:jc w:val="both"/>
       </w:pPr>
@@ -4467,19 +4311,19 @@
           <w:b/>
           <w:color w:val="000000"/>
         </w:rPr>
-        <w:t xml:space="preserve">• Functional Requirements (REQ-01 to REQ-15): </w:t>
+        <w:t xml:space="preserve">• Functional Requirements: </w:t>
       </w:r>
       <w:r>
         <w:rPr>
           <w:rFonts w:cs="Times New Roman"/>
           <w:color w:val="000000"/>
         </w:rPr>
-        <w:t>Includes UPI 2.0 QR scanning and signed URI construction (REQ-01, REQ-02), pre-intent pending state logging and 1-Tap Resume Popup verification (REQ-03 to REQ-05), 3-Tier auto-categorization and 1-tap first-time merchant tagging (REQ-06 to REQ-08), safe Z-Score anomaly banners and clamped Financial Health Score (REQ-09 to REQ-11), native Flet category/weekly charts and offline CSV export (REQ-12 to REQ-14), and 3-second post-payment quick tags with peer bill splitting (REQ-15).</w:t>
+        <w:t>Includes UPI 2.0 QR scanning and lossless signed URI construction, pre-intent pending state logging and 1-Tap Resume Popup verification, 3-Tier auto-categorization and 1-tap first-time merchant tagging, safe Z-Score anomaly alerts and clamped Financial Health Score, native Flet category/weekly charts, offline CSV export, and 3-second post-payment quick tags with peer bill splitting.</w:t>
       </w:r>
     </w:p>
     <w:p>
       <w:pPr>
-        <w:spacing w:after="60"/>
+        <w:spacing w:after="44"/>
         <w:ind w:left="397" w:hanging="227"/>
         <w:jc w:val="both"/>
       </w:pPr>
@@ -4502,7 +4346,7 @@
     <w:p>
       <w:pPr>
         <w:keepNext/>
-        <w:spacing w:before="200"/>
+        <w:spacing w:before="160"/>
       </w:pPr>
       <w:r>
         <w:rPr>
@@ -4516,7 +4360,7 @@
     </w:p>
     <w:p>
       <w:pPr>
-        <w:spacing w:after="90"/>
+        <w:spacing w:after="76"/>
         <w:jc w:val="both"/>
       </w:pPr>
       <w:r>
@@ -4529,7 +4373,7 @@
     </w:p>
     <w:p>
       <w:pPr>
-        <w:spacing w:after="60"/>
+        <w:spacing w:after="44"/>
         <w:ind w:left="397" w:hanging="227"/>
         <w:jc w:val="both"/>
       </w:pPr>
@@ -4551,7 +4395,7 @@
     </w:p>
     <w:p>
       <w:pPr>
-        <w:spacing w:after="60"/>
+        <w:spacing w:after="44"/>
         <w:ind w:left="397" w:hanging="227"/>
         <w:jc w:val="both"/>
       </w:pPr>
@@ -4573,7 +4417,7 @@
     </w:p>
     <w:p>
       <w:pPr>
-        <w:spacing w:after="60"/>
+        <w:spacing w:after="44"/>
         <w:ind w:left="397" w:hanging="227"/>
         <w:jc w:val="both"/>
       </w:pPr>
@@ -4595,7 +4439,7 @@
     </w:p>
     <w:p>
       <w:pPr>
-        <w:spacing w:after="60"/>
+        <w:spacing w:after="44"/>
         <w:ind w:left="397" w:hanging="227"/>
         <w:jc w:val="both"/>
       </w:pPr>
@@ -4605,14 +4449,14 @@
           <w:b/>
           <w:color w:val="000000"/>
         </w:rPr>
-        <w:t xml:space="preserve">• 4. Extensible Open-Source Contract Architecture: </w:t>
+        <w:t xml:space="preserve">• 4. Extensible Modular Architecture: </w:t>
       </w:r>
       <w:r>
         <w:rPr>
           <w:rFonts w:cs="Times New Roman"/>
           <w:color w:val="000000"/>
         </w:rPr>
-        <w:t>Our decoupled plug-and-play contract registry ('src/contracts.py') allows future integration with the Account Aggregator (AA) framework, voice-assisted UPI 123Pay logs, and automated GST merchant invoice extraction for small business owners.</w:t>
+        <w:t>Our decoupled plug-and-play module architecture allows future integration with the Account Aggregator (AA) framework, voice-assisted UPI 123Pay logs, and automated GST merchant invoice extraction for small business owners.</w:t>
       </w:r>
     </w:p>
     <w:sectPr>
@@ -4663,7 +4507,7 @@
       <w:rPr>
         <w:rFonts w:cs="Times New Roman"/>
         <w:color w:val="000000"/>
-        <w:sz w:val="20"/>
+        <w:sz w:val="22"/>
       </w:rPr>
       <w:fldChar w:fldCharType="begin"/>
     </w:r>
@@ -4671,7 +4515,7 @@
       <w:rPr>
         <w:rFonts w:cs="Times New Roman"/>
         <w:color w:val="000000"/>
-        <w:sz w:val="20"/>
+        <w:sz w:val="22"/>
       </w:rPr>
       <w:instrText xml:space="preserve"> PAGE </w:instrText>
     </w:r>
@@ -4679,7 +4523,7 @@
       <w:rPr>
         <w:rFonts w:cs="Times New Roman"/>
         <w:color w:val="000000"/>
-        <w:sz w:val="20"/>
+        <w:sz w:val="22"/>
       </w:rPr>
       <w:fldChar w:fldCharType="separate"/>
     </w:r>
@@ -4688,7 +4532,7 @@
         <w:rFonts w:cs="Times New Roman"/>
         <w:noProof/>
         <w:color w:val="000000"/>
-        <w:sz w:val="20"/>
+        <w:sz w:val="22"/>
       </w:rPr>
       <w:t>2</w:t>
     </w:r>
@@ -4696,7 +4540,7 @@
       <w:rPr>
         <w:rFonts w:cs="Times New Roman"/>
         <w:color w:val="000000"/>
-        <w:sz w:val="20"/>
+        <w:sz w:val="22"/>
       </w:rPr>
       <w:fldChar w:fldCharType="end"/>
     </w:r>
@@ -4902,31 +4746,31 @@
       </w:rPr>
     </w:lvl>
   </w:abstractNum>
-  <w:num w:numId="1" w16cid:durableId="278417255">
+  <w:num w:numId="1" w16cid:durableId="1774396556">
     <w:abstractNumId w:val="8"/>
   </w:num>
-  <w:num w:numId="2" w16cid:durableId="765078853">
+  <w:num w:numId="2" w16cid:durableId="110786143">
     <w:abstractNumId w:val="6"/>
   </w:num>
-  <w:num w:numId="3" w16cid:durableId="1840850376">
+  <w:num w:numId="3" w16cid:durableId="740638747">
     <w:abstractNumId w:val="5"/>
   </w:num>
-  <w:num w:numId="4" w16cid:durableId="1368989485">
+  <w:num w:numId="4" w16cid:durableId="923731621">
     <w:abstractNumId w:val="4"/>
   </w:num>
-  <w:num w:numId="5" w16cid:durableId="50347516">
+  <w:num w:numId="5" w16cid:durableId="37826202">
     <w:abstractNumId w:val="7"/>
   </w:num>
-  <w:num w:numId="6" w16cid:durableId="216430834">
+  <w:num w:numId="6" w16cid:durableId="275254517">
     <w:abstractNumId w:val="3"/>
   </w:num>
-  <w:num w:numId="7" w16cid:durableId="1519081194">
+  <w:num w:numId="7" w16cid:durableId="719010973">
     <w:abstractNumId w:val="2"/>
   </w:num>
-  <w:num w:numId="8" w16cid:durableId="1193345701">
+  <w:num w:numId="8" w16cid:durableId="1369917186">
     <w:abstractNumId w:val="1"/>
   </w:num>
-  <w:num w:numId="9" w16cid:durableId="615333309">
+  <w:num w:numId="9" w16cid:durableId="464205352">
     <w:abstractNumId w:val="0"/>
   </w:num>
 </w:numbering>

</xml_diff>